<commit_message>
learning materials doc. added, research questions modified & implementation doc. partial code documentation was added
</commit_message>
<xml_diff>
--- a/Individual project/LO-03/Implementation/Realization document.docx
+++ b/Individual project/LO-03/Implementation/Realization document.docx
@@ -16,14 +16,7 @@
           <w:b/>
           <w:sz w:val="72"/>
         </w:rPr>
-        <w:t xml:space="preserve">Realization </w:t>
-      </w:r>
-      <w:r>
-        <w:rPr>
-          <w:b/>
-          <w:sz w:val="72"/>
-        </w:rPr>
-        <w:t>document</w:t>
+        <w:t>Realization document</w:t>
       </w:r>
     </w:p>
     <w:p>
@@ -222,7 +215,7 @@
           <w:sz w:val="26"/>
           <w:szCs w:val="26"/>
         </w:rPr>
-        <w:t>2026-04-01</w:t>
+        <w:t>2026-04-15</w:t>
       </w:r>
       <w:r>
         <w:rPr>
@@ -516,6 +509,9 @@
         </mc:AlternateContent>
       </w:r>
       <w:r>
+        <w:rPr>
+          <w:noProof/>
+        </w:rPr>
         <w:drawing>
           <wp:anchor distT="0" distB="0" distL="114300" distR="114300" simplePos="0" relativeHeight="251658240" behindDoc="0" locked="0" layoutInCell="1" allowOverlap="1" wp14:anchorId="3467A7A4" wp14:editId="1542BDF3">
             <wp:simplePos x="0" y="0"/>
@@ -540,7 +536,7 @@
                     <pic:cNvPicPr/>
                   </pic:nvPicPr>
                   <pic:blipFill>
-                    <a:blip r:embed="rId5">
+                    <a:blip r:embed="rId6">
                       <a:extLst>
                         <a:ext uri="{28A0092B-C50C-407E-A947-70E740481C1C}">
                           <a14:useLocalDpi xmlns:a14="http://schemas.microsoft.com/office/drawing/2010/main" val="0"/>
@@ -791,6 +787,2072 @@
     </w:p>
     <w:p>
       <w:pPr>
+        <w:spacing w:line="360" w:lineRule="auto"/>
+        <w:ind w:left="284"/>
+        <w:rPr>
+          <w:u w:val="single"/>
+        </w:rPr>
+      </w:pPr>
+      <w:r>
+        <w:rPr>
+          <w:u w:val="single"/>
+        </w:rPr>
+        <w:lastRenderedPageBreak/>
+        <w:t>Domain directory</w:t>
+      </w:r>
+    </w:p>
+    <w:p>
+      <w:pPr>
+        <w:spacing w:line="360" w:lineRule="auto"/>
+        <w:ind w:left="284"/>
+      </w:pPr>
+      <w:r>
+        <w:rPr>
+          <w:noProof/>
+        </w:rPr>
+        <mc:AlternateContent>
+          <mc:Choice Requires="wps">
+            <w:drawing>
+              <wp:anchor distT="0" distB="0" distL="114300" distR="114300" simplePos="0" relativeHeight="251663360" behindDoc="0" locked="0" layoutInCell="1" allowOverlap="1" wp14:anchorId="769D4E2F" wp14:editId="1C8EC650">
+                <wp:simplePos x="0" y="0"/>
+                <wp:positionH relativeFrom="column">
+                  <wp:posOffset>180975</wp:posOffset>
+                </wp:positionH>
+                <wp:positionV relativeFrom="paragraph">
+                  <wp:posOffset>2114550</wp:posOffset>
+                </wp:positionV>
+                <wp:extent cx="3009900" cy="635"/>
+                <wp:effectExtent l="0" t="0" r="0" b="0"/>
+                <wp:wrapTopAndBottom/>
+                <wp:docPr id="367920326" name="Text Box 1"/>
+                <wp:cNvGraphicFramePr/>
+                <a:graphic xmlns:a="http://schemas.openxmlformats.org/drawingml/2006/main">
+                  <a:graphicData uri="http://schemas.microsoft.com/office/word/2010/wordprocessingShape">
+                    <wps:wsp>
+                      <wps:cNvSpPr txBox="1"/>
+                      <wps:spPr>
+                        <a:xfrm>
+                          <a:off x="0" y="0"/>
+                          <a:ext cx="3009900" cy="635"/>
+                        </a:xfrm>
+                        <a:prstGeom prst="rect">
+                          <a:avLst/>
+                        </a:prstGeom>
+                        <a:solidFill>
+                          <a:prstClr val="white"/>
+                        </a:solidFill>
+                        <a:ln>
+                          <a:noFill/>
+                        </a:ln>
+                      </wps:spPr>
+                      <wps:txbx>
+                        <w:txbxContent>
+                          <w:p>
+                            <w:pPr>
+                              <w:pStyle w:val="Caption"/>
+                              <w:jc w:val="center"/>
+                              <w:rPr>
+                                <w:sz w:val="20"/>
+                                <w:szCs w:val="20"/>
+                              </w:rPr>
+                            </w:pPr>
+                            <w:r>
+                              <w:t xml:space="preserve">Figure </w:t>
+                            </w:r>
+                            <w:r>
+                              <w:fldChar w:fldCharType="begin"/>
+                            </w:r>
+                            <w:r>
+                              <w:instrText xml:space="preserve"> SEQ Figure \* ARABIC </w:instrText>
+                            </w:r>
+                            <w:r>
+                              <w:fldChar w:fldCharType="separate"/>
+                            </w:r>
+                            <w:r>
+                              <w:rPr>
+                                <w:noProof/>
+                              </w:rPr>
+                              <w:t>2</w:t>
+                            </w:r>
+                            <w:r>
+                              <w:fldChar w:fldCharType="end"/>
+                            </w:r>
+                            <w:r>
+                              <w:t>: Domain directory snapshot</w:t>
+                            </w:r>
+                          </w:p>
+                        </w:txbxContent>
+                      </wps:txbx>
+                      <wps:bodyPr rot="0" spcFirstLastPara="0" vertOverflow="overflow" horzOverflow="overflow" vert="horz" wrap="square" lIns="0" tIns="0" rIns="0" bIns="0" numCol="1" spcCol="0" rtlCol="0" fromWordArt="0" anchor="t" anchorCtr="0" forceAA="0" compatLnSpc="1">
+                        <a:prstTxWarp prst="textNoShape">
+                          <a:avLst/>
+                        </a:prstTxWarp>
+                        <a:spAutoFit/>
+                      </wps:bodyPr>
+                    </wps:wsp>
+                  </a:graphicData>
+                </a:graphic>
+              </wp:anchor>
+            </w:drawing>
+          </mc:Choice>
+          <mc:Fallback>
+            <w:pict>
+              <v:shape w14:anchorId="769D4E2F" id="_x0000_s1027" type="#_x0000_t202" style="position:absolute;left:0;text-align:left;margin-left:14.25pt;margin-top:166.5pt;width:237pt;height:.05pt;z-index:251663360;visibility:visible;mso-wrap-style:square;mso-wrap-distance-left:9pt;mso-wrap-distance-top:0;mso-wrap-distance-right:9pt;mso-wrap-distance-bottom:0;mso-position-horizontal:absolute;mso-position-horizontal-relative:text;mso-position-vertical:absolute;mso-position-vertical-relative:text;v-text-anchor:top" o:gfxdata="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" stroked="f">
+                <v:textbox style="mso-fit-shape-to-text:t" inset="0,0,0,0">
+                  <w:txbxContent>
+                    <w:p>
+                      <w:pPr>
+                        <w:pStyle w:val="Caption"/>
+                        <w:jc w:val="center"/>
+                        <w:rPr>
+                          <w:sz w:val="20"/>
+                          <w:szCs w:val="20"/>
+                        </w:rPr>
+                      </w:pPr>
+                      <w:r>
+                        <w:t xml:space="preserve">Figure </w:t>
+                      </w:r>
+                      <w:r>
+                        <w:fldChar w:fldCharType="begin"/>
+                      </w:r>
+                      <w:r>
+                        <w:instrText xml:space="preserve"> SEQ Figure \* ARABIC </w:instrText>
+                      </w:r>
+                      <w:r>
+                        <w:fldChar w:fldCharType="separate"/>
+                      </w:r>
+                      <w:r>
+                        <w:rPr>
+                          <w:noProof/>
+                        </w:rPr>
+                        <w:t>2</w:t>
+                      </w:r>
+                      <w:r>
+                        <w:fldChar w:fldCharType="end"/>
+                      </w:r>
+                      <w:r>
+                        <w:t>: Domain directory snapshot</w:t>
+                      </w:r>
+                    </w:p>
+                  </w:txbxContent>
+                </v:textbox>
+                <w10:wrap type="topAndBottom"/>
+              </v:shape>
+            </w:pict>
+          </mc:Fallback>
+        </mc:AlternateContent>
+      </w:r>
+      <w:r>
+        <w:drawing>
+          <wp:anchor distT="0" distB="0" distL="114300" distR="114300" simplePos="0" relativeHeight="251661312" behindDoc="0" locked="0" layoutInCell="1" allowOverlap="1" wp14:anchorId="13E554B1" wp14:editId="3108335C">
+            <wp:simplePos x="0" y="0"/>
+            <wp:positionH relativeFrom="column">
+              <wp:posOffset>180975</wp:posOffset>
+            </wp:positionH>
+            <wp:positionV relativeFrom="paragraph">
+              <wp:posOffset>0</wp:posOffset>
+            </wp:positionV>
+            <wp:extent cx="3009900" cy="2057400"/>
+            <wp:effectExtent l="0" t="0" r="0" b="0"/>
+            <wp:wrapTopAndBottom/>
+            <wp:docPr id="635153354" name="Picture 1"/>
+            <wp:cNvGraphicFramePr>
+              <a:graphicFrameLocks xmlns:a="http://schemas.openxmlformats.org/drawingml/2006/main" noChangeAspect="1"/>
+            </wp:cNvGraphicFramePr>
+            <a:graphic xmlns:a="http://schemas.openxmlformats.org/drawingml/2006/main">
+              <a:graphicData uri="http://schemas.openxmlformats.org/drawingml/2006/picture">
+                <pic:pic xmlns:pic="http://schemas.openxmlformats.org/drawingml/2006/picture">
+                  <pic:nvPicPr>
+                    <pic:cNvPr id="635153354" name=""/>
+                    <pic:cNvPicPr/>
+                  </pic:nvPicPr>
+                  <pic:blipFill>
+                    <a:blip r:embed="rId7">
+                      <a:extLst>
+                        <a:ext uri="{28A0092B-C50C-407E-A947-70E740481C1C}">
+                          <a14:useLocalDpi xmlns:a14="http://schemas.microsoft.com/office/drawing/2010/main" val="0"/>
+                        </a:ext>
+                      </a:extLst>
+                    </a:blip>
+                    <a:stretch>
+                      <a:fillRect/>
+                    </a:stretch>
+                  </pic:blipFill>
+                  <pic:spPr>
+                    <a:xfrm>
+                      <a:off x="0" y="0"/>
+                      <a:ext cx="3009900" cy="2057400"/>
+                    </a:xfrm>
+                    <a:prstGeom prst="rect">
+                      <a:avLst/>
+                    </a:prstGeom>
+                  </pic:spPr>
+                </pic:pic>
+              </a:graphicData>
+            </a:graphic>
+          </wp:anchor>
+        </w:drawing>
+      </w:r>
+      <w:r>
+        <w:t xml:space="preserve">Under the Models folder are located the models, containing </w:t>
+      </w:r>
+      <w:proofErr w:type="gramStart"/>
+      <w:r>
+        <w:t>all of</w:t>
+      </w:r>
+      <w:proofErr w:type="gramEnd"/>
+      <w:r>
+        <w:t xml:space="preserve"> the business data.</w:t>
+      </w:r>
+    </w:p>
+    <w:p>
+      <w:pPr>
+        <w:spacing w:line="360" w:lineRule="auto"/>
+        <w:ind w:left="284"/>
+      </w:pPr>
+    </w:p>
+    <w:p>
+      <w:pPr>
+        <w:spacing w:line="360" w:lineRule="auto"/>
+        <w:ind w:left="284"/>
+      </w:pPr>
+      <w:r>
+        <w:t>Example:</w:t>
+      </w:r>
+    </w:p>
+    <w:p>
+      <w:pPr>
+        <w:spacing w:line="360" w:lineRule="auto"/>
+        <w:ind w:left="284"/>
+      </w:pPr>
+      <w:r>
+        <w:rPr>
+          <w:noProof/>
+        </w:rPr>
+        <mc:AlternateContent>
+          <mc:Choice Requires="wps">
+            <w:drawing>
+              <wp:anchor distT="0" distB="0" distL="114300" distR="114300" simplePos="0" relativeHeight="251666432" behindDoc="0" locked="0" layoutInCell="1" allowOverlap="1" wp14:anchorId="2FCAA0F1" wp14:editId="06432CE8">
+                <wp:simplePos x="0" y="0"/>
+                <wp:positionH relativeFrom="column">
+                  <wp:posOffset>181610</wp:posOffset>
+                </wp:positionH>
+                <wp:positionV relativeFrom="paragraph">
+                  <wp:posOffset>3637915</wp:posOffset>
+                </wp:positionV>
+                <wp:extent cx="4993005" cy="635"/>
+                <wp:effectExtent l="0" t="0" r="0" b="0"/>
+                <wp:wrapTopAndBottom/>
+                <wp:docPr id="76166843" name="Text Box 1"/>
+                <wp:cNvGraphicFramePr/>
+                <a:graphic xmlns:a="http://schemas.openxmlformats.org/drawingml/2006/main">
+                  <a:graphicData uri="http://schemas.microsoft.com/office/word/2010/wordprocessingShape">
+                    <wps:wsp>
+                      <wps:cNvSpPr txBox="1"/>
+                      <wps:spPr>
+                        <a:xfrm>
+                          <a:off x="0" y="0"/>
+                          <a:ext cx="4993005" cy="635"/>
+                        </a:xfrm>
+                        <a:prstGeom prst="rect">
+                          <a:avLst/>
+                        </a:prstGeom>
+                        <a:solidFill>
+                          <a:prstClr val="white"/>
+                        </a:solidFill>
+                        <a:ln>
+                          <a:noFill/>
+                        </a:ln>
+                      </wps:spPr>
+                      <wps:txbx>
+                        <w:txbxContent>
+                          <w:p>
+                            <w:pPr>
+                              <w:pStyle w:val="Caption"/>
+                              <w:jc w:val="center"/>
+                              <w:rPr>
+                                <w:noProof/>
+                                <w:sz w:val="20"/>
+                                <w:szCs w:val="20"/>
+                              </w:rPr>
+                            </w:pPr>
+                            <w:r>
+                              <w:t xml:space="preserve">Figure </w:t>
+                            </w:r>
+                            <w:r>
+                              <w:fldChar w:fldCharType="begin"/>
+                            </w:r>
+                            <w:r>
+                              <w:instrText xml:space="preserve"> SEQ Figure \* ARABIC </w:instrText>
+                            </w:r>
+                            <w:r>
+                              <w:fldChar w:fldCharType="separate"/>
+                            </w:r>
+                            <w:r>
+                              <w:rPr>
+                                <w:noProof/>
+                              </w:rPr>
+                              <w:t>3</w:t>
+                            </w:r>
+                            <w:r>
+                              <w:fldChar w:fldCharType="end"/>
+                            </w:r>
+                            <w:r>
+                              <w:t xml:space="preserve">: </w:t>
+                            </w:r>
+                            <w:r>
+                              <w:t>Gallery model</w:t>
+                            </w:r>
+                          </w:p>
+                        </w:txbxContent>
+                      </wps:txbx>
+                      <wps:bodyPr rot="0" spcFirstLastPara="0" vertOverflow="overflow" horzOverflow="overflow" vert="horz" wrap="square" lIns="0" tIns="0" rIns="0" bIns="0" numCol="1" spcCol="0" rtlCol="0" fromWordArt="0" anchor="t" anchorCtr="0" forceAA="0" compatLnSpc="1">
+                        <a:prstTxWarp prst="textNoShape">
+                          <a:avLst/>
+                        </a:prstTxWarp>
+                        <a:spAutoFit/>
+                      </wps:bodyPr>
+                    </wps:wsp>
+                  </a:graphicData>
+                </a:graphic>
+              </wp:anchor>
+            </w:drawing>
+          </mc:Choice>
+          <mc:Fallback>
+            <w:pict>
+              <v:shape w14:anchorId="2FCAA0F1" id="_x0000_s1028" type="#_x0000_t202" style="position:absolute;left:0;text-align:left;margin-left:14.3pt;margin-top:286.45pt;width:393.15pt;height:.05pt;z-index:251666432;visibility:visible;mso-wrap-style:square;mso-wrap-distance-left:9pt;mso-wrap-distance-top:0;mso-wrap-distance-right:9pt;mso-wrap-distance-bottom:0;mso-position-horizontal:absolute;mso-position-horizontal-relative:text;mso-position-vertical:absolute;mso-position-vertical-relative:text;v-text-anchor:top" o:gfxdata="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" stroked="f">
+                <v:textbox style="mso-fit-shape-to-text:t" inset="0,0,0,0">
+                  <w:txbxContent>
+                    <w:p>
+                      <w:pPr>
+                        <w:pStyle w:val="Caption"/>
+                        <w:jc w:val="center"/>
+                        <w:rPr>
+                          <w:noProof/>
+                          <w:sz w:val="20"/>
+                          <w:szCs w:val="20"/>
+                        </w:rPr>
+                      </w:pPr>
+                      <w:r>
+                        <w:t xml:space="preserve">Figure </w:t>
+                      </w:r>
+                      <w:r>
+                        <w:fldChar w:fldCharType="begin"/>
+                      </w:r>
+                      <w:r>
+                        <w:instrText xml:space="preserve"> SEQ Figure \* ARABIC </w:instrText>
+                      </w:r>
+                      <w:r>
+                        <w:fldChar w:fldCharType="separate"/>
+                      </w:r>
+                      <w:r>
+                        <w:rPr>
+                          <w:noProof/>
+                        </w:rPr>
+                        <w:t>3</w:t>
+                      </w:r>
+                      <w:r>
+                        <w:fldChar w:fldCharType="end"/>
+                      </w:r>
+                      <w:r>
+                        <w:t xml:space="preserve">: </w:t>
+                      </w:r>
+                      <w:r>
+                        <w:t>Gallery model</w:t>
+                      </w:r>
+                    </w:p>
+                  </w:txbxContent>
+                </v:textbox>
+                <w10:wrap type="topAndBottom"/>
+              </v:shape>
+            </w:pict>
+          </mc:Fallback>
+        </mc:AlternateContent>
+      </w:r>
+      <w:r>
+        <w:rPr>
+          <w:noProof/>
+          <w14:ligatures w14:val="standardContextual"/>
+        </w:rPr>
+        <w:drawing>
+          <wp:anchor distT="0" distB="0" distL="114300" distR="114300" simplePos="0" relativeHeight="251664384" behindDoc="0" locked="0" layoutInCell="1" allowOverlap="1" wp14:anchorId="4248A3EA" wp14:editId="0D693175">
+            <wp:simplePos x="0" y="0"/>
+            <wp:positionH relativeFrom="column">
+              <wp:posOffset>181610</wp:posOffset>
+            </wp:positionH>
+            <wp:positionV relativeFrom="paragraph">
+              <wp:posOffset>101063</wp:posOffset>
+            </wp:positionV>
+            <wp:extent cx="4993005" cy="3479800"/>
+            <wp:effectExtent l="0" t="0" r="0" b="6350"/>
+            <wp:wrapTopAndBottom/>
+            <wp:docPr id="1217290893" name="Picture 1"/>
+            <wp:cNvGraphicFramePr>
+              <a:graphicFrameLocks xmlns:a="http://schemas.openxmlformats.org/drawingml/2006/main" noChangeAspect="1"/>
+            </wp:cNvGraphicFramePr>
+            <a:graphic xmlns:a="http://schemas.openxmlformats.org/drawingml/2006/main">
+              <a:graphicData uri="http://schemas.openxmlformats.org/drawingml/2006/picture">
+                <pic:pic xmlns:pic="http://schemas.openxmlformats.org/drawingml/2006/picture">
+                  <pic:nvPicPr>
+                    <pic:cNvPr id="1217290893" name=""/>
+                    <pic:cNvPicPr/>
+                  </pic:nvPicPr>
+                  <pic:blipFill>
+                    <a:blip r:embed="rId8">
+                      <a:extLst>
+                        <a:ext uri="{28A0092B-C50C-407E-A947-70E740481C1C}">
+                          <a14:useLocalDpi xmlns:a14="http://schemas.microsoft.com/office/drawing/2010/main" val="0"/>
+                        </a:ext>
+                      </a:extLst>
+                    </a:blip>
+                    <a:stretch>
+                      <a:fillRect/>
+                    </a:stretch>
+                  </pic:blipFill>
+                  <pic:spPr>
+                    <a:xfrm>
+                      <a:off x="0" y="0"/>
+                      <a:ext cx="4993005" cy="3479800"/>
+                    </a:xfrm>
+                    <a:prstGeom prst="rect">
+                      <a:avLst/>
+                    </a:prstGeom>
+                  </pic:spPr>
+                </pic:pic>
+              </a:graphicData>
+            </a:graphic>
+            <wp14:sizeRelH relativeFrom="margin">
+              <wp14:pctWidth>0</wp14:pctWidth>
+            </wp14:sizeRelH>
+            <wp14:sizeRelV relativeFrom="margin">
+              <wp14:pctHeight>0</wp14:pctHeight>
+            </wp14:sizeRelV>
+          </wp:anchor>
+        </w:drawing>
+      </w:r>
+      <w:r>
+        <w:t>Overview: A simple class, containing attributes</w:t>
+      </w:r>
+      <w:r>
+        <w:t xml:space="preserve"> (columns) of the database like ID of a picture, the relative path to the picture itself, a reference to the specific, all with their given data type.</w:t>
+      </w:r>
+    </w:p>
+    <w:p/>
+    <w:p/>
+    <w:p>
+      <w:pPr>
+        <w:ind w:left="284"/>
+        <w:rPr>
+          <w:u w:val="single"/>
+        </w:rPr>
+      </w:pPr>
+      <w:r>
+        <w:rPr>
+          <w:u w:val="single"/>
+        </w:rPr>
+        <w:t>DAL directory</w:t>
+      </w:r>
+    </w:p>
+    <w:p>
+      <w:pPr>
+        <w:ind w:left="284"/>
+      </w:pPr>
+    </w:p>
+    <w:p>
+      <w:pPr>
+        <w:keepNext/>
+        <w:ind w:left="284"/>
+      </w:pPr>
+      <w:r>
+        <w:lastRenderedPageBreak/>
+        <w:drawing>
+          <wp:anchor distT="0" distB="0" distL="114300" distR="114300" simplePos="0" relativeHeight="251667456" behindDoc="0" locked="0" layoutInCell="1" allowOverlap="1" wp14:anchorId="3B32B57B" wp14:editId="7B0B1622">
+            <wp:simplePos x="0" y="0"/>
+            <wp:positionH relativeFrom="column">
+              <wp:posOffset>181708</wp:posOffset>
+            </wp:positionH>
+            <wp:positionV relativeFrom="paragraph">
+              <wp:posOffset>0</wp:posOffset>
+            </wp:positionV>
+            <wp:extent cx="2576378" cy="1494692"/>
+            <wp:effectExtent l="0" t="0" r="0" b="0"/>
+            <wp:wrapTopAndBottom/>
+            <wp:docPr id="124447435" name="Picture 1"/>
+            <wp:cNvGraphicFramePr>
+              <a:graphicFrameLocks xmlns:a="http://schemas.openxmlformats.org/drawingml/2006/main" noChangeAspect="1"/>
+            </wp:cNvGraphicFramePr>
+            <a:graphic xmlns:a="http://schemas.openxmlformats.org/drawingml/2006/main">
+              <a:graphicData uri="http://schemas.openxmlformats.org/drawingml/2006/picture">
+                <pic:pic xmlns:pic="http://schemas.openxmlformats.org/drawingml/2006/picture">
+                  <pic:nvPicPr>
+                    <pic:cNvPr id="124447435" name=""/>
+                    <pic:cNvPicPr/>
+                  </pic:nvPicPr>
+                  <pic:blipFill>
+                    <a:blip r:embed="rId9">
+                      <a:extLst>
+                        <a:ext uri="{28A0092B-C50C-407E-A947-70E740481C1C}">
+                          <a14:useLocalDpi xmlns:a14="http://schemas.microsoft.com/office/drawing/2010/main" val="0"/>
+                        </a:ext>
+                      </a:extLst>
+                    </a:blip>
+                    <a:stretch>
+                      <a:fillRect/>
+                    </a:stretch>
+                  </pic:blipFill>
+                  <pic:spPr>
+                    <a:xfrm>
+                      <a:off x="0" y="0"/>
+                      <a:ext cx="2576378" cy="1494692"/>
+                    </a:xfrm>
+                    <a:prstGeom prst="rect">
+                      <a:avLst/>
+                    </a:prstGeom>
+                  </pic:spPr>
+                </pic:pic>
+              </a:graphicData>
+            </a:graphic>
+          </wp:anchor>
+        </w:drawing>
+      </w:r>
+    </w:p>
+    <w:p>
+      <w:pPr>
+        <w:pStyle w:val="Caption"/>
+        <w:ind w:firstLine="720"/>
+      </w:pPr>
+      <w:r>
+        <w:t xml:space="preserve">Figure </w:t>
+      </w:r>
+      <w:r>
+        <w:fldChar w:fldCharType="begin"/>
+      </w:r>
+      <w:r>
+        <w:instrText xml:space="preserve"> SEQ Figure \* ARABIC </w:instrText>
+      </w:r>
+      <w:r>
+        <w:fldChar w:fldCharType="separate"/>
+      </w:r>
+      <w:r>
+        <w:rPr>
+          <w:noProof/>
+        </w:rPr>
+        <w:t>4</w:t>
+      </w:r>
+      <w:r>
+        <w:fldChar w:fldCharType="end"/>
+      </w:r>
+      <w:r>
+        <w:t>: DAL directory snapshot</w:t>
+      </w:r>
+    </w:p>
+    <w:p>
+      <w:pPr>
+        <w:ind w:left="284"/>
+      </w:pPr>
+      <w:r>
+        <w:t>The</w:t>
+      </w:r>
+      <w:r>
+        <w:t xml:space="preserve"> </w:t>
+      </w:r>
+      <w:r>
+        <w:rPr>
+          <w:b/>
+          <w:bCs/>
+        </w:rPr>
+        <w:t>Data</w:t>
+      </w:r>
+      <w:r>
+        <w:rPr>
+          <w:b/>
+          <w:bCs/>
+        </w:rPr>
+        <w:t xml:space="preserve"> </w:t>
+      </w:r>
+      <w:r>
+        <w:t>folder</w:t>
+      </w:r>
+      <w:r>
+        <w:t xml:space="preserve"> contains the ASP.NET migrations, in </w:t>
+      </w:r>
+      <w:r>
+        <w:rPr>
+          <w:b/>
+          <w:bCs/>
+        </w:rPr>
+        <w:t>Interfaces</w:t>
+      </w:r>
+      <w:r>
+        <w:rPr>
+          <w:b/>
+          <w:bCs/>
+        </w:rPr>
+        <w:t xml:space="preserve"> </w:t>
+      </w:r>
+      <w:r>
+        <w:t>folder</w:t>
+      </w:r>
+      <w:r>
+        <w:t xml:space="preserve"> all the interfaces dictating the behaviour and the </w:t>
+      </w:r>
+      <w:r>
+        <w:rPr>
+          <w:b/>
+          <w:bCs/>
+        </w:rPr>
+        <w:t>Repositories</w:t>
+      </w:r>
+      <w:r>
+        <w:rPr>
+          <w:b/>
+          <w:bCs/>
+        </w:rPr>
+        <w:t xml:space="preserve"> </w:t>
+      </w:r>
+      <w:r>
+        <w:t>folder</w:t>
+      </w:r>
+      <w:r>
+        <w:t xml:space="preserve"> contains the implementation of those behaviours.</w:t>
+      </w:r>
+    </w:p>
+    <w:p>
+      <w:pPr>
+        <w:ind w:left="284"/>
+      </w:pPr>
+    </w:p>
+    <w:p>
+      <w:pPr>
+        <w:ind w:left="284"/>
+      </w:pPr>
+      <w:r>
+        <w:rPr>
+          <w:noProof/>
+        </w:rPr>
+        <mc:AlternateContent>
+          <mc:Choice Requires="wps">
+            <w:drawing>
+              <wp:anchor distT="0" distB="0" distL="114300" distR="114300" simplePos="0" relativeHeight="251670528" behindDoc="0" locked="0" layoutInCell="1" allowOverlap="1" wp14:anchorId="74989B52" wp14:editId="0ED4BBBD">
+                <wp:simplePos x="0" y="0"/>
+                <wp:positionH relativeFrom="column">
+                  <wp:posOffset>181610</wp:posOffset>
+                </wp:positionH>
+                <wp:positionV relativeFrom="paragraph">
+                  <wp:posOffset>3289300</wp:posOffset>
+                </wp:positionV>
+                <wp:extent cx="5943600" cy="635"/>
+                <wp:effectExtent l="0" t="0" r="0" b="0"/>
+                <wp:wrapTopAndBottom/>
+                <wp:docPr id="2071569528" name="Text Box 1"/>
+                <wp:cNvGraphicFramePr/>
+                <a:graphic xmlns:a="http://schemas.openxmlformats.org/drawingml/2006/main">
+                  <a:graphicData uri="http://schemas.microsoft.com/office/word/2010/wordprocessingShape">
+                    <wps:wsp>
+                      <wps:cNvSpPr txBox="1"/>
+                      <wps:spPr>
+                        <a:xfrm>
+                          <a:off x="0" y="0"/>
+                          <a:ext cx="5943600" cy="635"/>
+                        </a:xfrm>
+                        <a:prstGeom prst="rect">
+                          <a:avLst/>
+                        </a:prstGeom>
+                        <a:solidFill>
+                          <a:prstClr val="white"/>
+                        </a:solidFill>
+                        <a:ln>
+                          <a:noFill/>
+                        </a:ln>
+                      </wps:spPr>
+                      <wps:txbx>
+                        <w:txbxContent>
+                          <w:p>
+                            <w:pPr>
+                              <w:pStyle w:val="Caption"/>
+                              <w:jc w:val="center"/>
+                              <w:rPr>
+                                <w:lang w:val="en-US"/>
+                              </w:rPr>
+                            </w:pPr>
+                            <w:r>
+                              <w:t xml:space="preserve">Figure </w:t>
+                            </w:r>
+                            <w:r>
+                              <w:fldChar w:fldCharType="begin"/>
+                            </w:r>
+                            <w:r>
+                              <w:instrText xml:space="preserve"> SEQ Figure \* ARABIC </w:instrText>
+                            </w:r>
+                            <w:r>
+                              <w:fldChar w:fldCharType="separate"/>
+                            </w:r>
+                            <w:r>
+                              <w:rPr>
+                                <w:noProof/>
+                              </w:rPr>
+                              <w:t>5</w:t>
+                            </w:r>
+                            <w:r>
+                              <w:fldChar w:fldCharType="end"/>
+                            </w:r>
+                            <w:r>
+                              <w:t xml:space="preserve">: </w:t>
+                            </w:r>
+                            <w:proofErr w:type="spellStart"/>
+                            <w:r>
+                              <w:rPr>
+                                <w:lang w:val="en-US"/>
+                              </w:rPr>
+                              <w:t>ICrudRepository</w:t>
+                            </w:r>
+                            <w:proofErr w:type="spellEnd"/>
+                            <w:r>
+                              <w:rPr>
+                                <w:lang w:val="en-US"/>
+                              </w:rPr>
+                              <w:t xml:space="preserve"> interface</w:t>
+                            </w:r>
+                          </w:p>
+                        </w:txbxContent>
+                      </wps:txbx>
+                      <wps:bodyPr rot="0" spcFirstLastPara="0" vertOverflow="overflow" horzOverflow="overflow" vert="horz" wrap="square" lIns="0" tIns="0" rIns="0" bIns="0" numCol="1" spcCol="0" rtlCol="0" fromWordArt="0" anchor="t" anchorCtr="0" forceAA="0" compatLnSpc="1">
+                        <a:prstTxWarp prst="textNoShape">
+                          <a:avLst/>
+                        </a:prstTxWarp>
+                        <a:spAutoFit/>
+                      </wps:bodyPr>
+                    </wps:wsp>
+                  </a:graphicData>
+                </a:graphic>
+              </wp:anchor>
+            </w:drawing>
+          </mc:Choice>
+          <mc:Fallback>
+            <w:pict>
+              <v:shape w14:anchorId="74989B52" id="_x0000_s1029" type="#_x0000_t202" style="position:absolute;left:0;text-align:left;margin-left:14.3pt;margin-top:259pt;width:468pt;height:.05pt;z-index:251670528;visibility:visible;mso-wrap-style:square;mso-wrap-distance-left:9pt;mso-wrap-distance-top:0;mso-wrap-distance-right:9pt;mso-wrap-distance-bottom:0;mso-position-horizontal:absolute;mso-position-horizontal-relative:text;mso-position-vertical:absolute;mso-position-vertical-relative:text;v-text-anchor:top" o:gfxdata="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" stroked="f">
+                <v:textbox style="mso-fit-shape-to-text:t" inset="0,0,0,0">
+                  <w:txbxContent>
+                    <w:p>
+                      <w:pPr>
+                        <w:pStyle w:val="Caption"/>
+                        <w:jc w:val="center"/>
+                        <w:rPr>
+                          <w:lang w:val="en-US"/>
+                        </w:rPr>
+                      </w:pPr>
+                      <w:r>
+                        <w:t xml:space="preserve">Figure </w:t>
+                      </w:r>
+                      <w:r>
+                        <w:fldChar w:fldCharType="begin"/>
+                      </w:r>
+                      <w:r>
+                        <w:instrText xml:space="preserve"> SEQ Figure \* ARABIC </w:instrText>
+                      </w:r>
+                      <w:r>
+                        <w:fldChar w:fldCharType="separate"/>
+                      </w:r>
+                      <w:r>
+                        <w:rPr>
+                          <w:noProof/>
+                        </w:rPr>
+                        <w:t>5</w:t>
+                      </w:r>
+                      <w:r>
+                        <w:fldChar w:fldCharType="end"/>
+                      </w:r>
+                      <w:r>
+                        <w:t xml:space="preserve">: </w:t>
+                      </w:r>
+                      <w:proofErr w:type="spellStart"/>
+                      <w:r>
+                        <w:rPr>
+                          <w:lang w:val="en-US"/>
+                        </w:rPr>
+                        <w:t>ICrudRepository</w:t>
+                      </w:r>
+                      <w:proofErr w:type="spellEnd"/>
+                      <w:r>
+                        <w:rPr>
+                          <w:lang w:val="en-US"/>
+                        </w:rPr>
+                        <w:t xml:space="preserve"> interface</w:t>
+                      </w:r>
+                    </w:p>
+                  </w:txbxContent>
+                </v:textbox>
+                <w10:wrap type="topAndBottom"/>
+              </v:shape>
+            </w:pict>
+          </mc:Fallback>
+        </mc:AlternateContent>
+      </w:r>
+      <w:r>
+        <w:rPr>
+          <w:noProof/>
+          <w14:ligatures w14:val="standardContextual"/>
+        </w:rPr>
+        <w:drawing>
+          <wp:anchor distT="0" distB="0" distL="114300" distR="114300" simplePos="0" relativeHeight="251668480" behindDoc="0" locked="0" layoutInCell="1" allowOverlap="1" wp14:anchorId="71789DB0" wp14:editId="71C15029">
+            <wp:simplePos x="0" y="0"/>
+            <wp:positionH relativeFrom="column">
+              <wp:posOffset>181610</wp:posOffset>
+            </wp:positionH>
+            <wp:positionV relativeFrom="paragraph">
+              <wp:posOffset>205252</wp:posOffset>
+            </wp:positionV>
+            <wp:extent cx="5943600" cy="3027045"/>
+            <wp:effectExtent l="0" t="0" r="0" b="1905"/>
+            <wp:wrapTopAndBottom/>
+            <wp:docPr id="1750647238" name="Picture 1"/>
+            <wp:cNvGraphicFramePr>
+              <a:graphicFrameLocks xmlns:a="http://schemas.openxmlformats.org/drawingml/2006/main" noChangeAspect="1"/>
+            </wp:cNvGraphicFramePr>
+            <a:graphic xmlns:a="http://schemas.openxmlformats.org/drawingml/2006/main">
+              <a:graphicData uri="http://schemas.openxmlformats.org/drawingml/2006/picture">
+                <pic:pic xmlns:pic="http://schemas.openxmlformats.org/drawingml/2006/picture">
+                  <pic:nvPicPr>
+                    <pic:cNvPr id="1750647238" name=""/>
+                    <pic:cNvPicPr/>
+                  </pic:nvPicPr>
+                  <pic:blipFill>
+                    <a:blip r:embed="rId10">
+                      <a:extLst>
+                        <a:ext uri="{28A0092B-C50C-407E-A947-70E740481C1C}">
+                          <a14:useLocalDpi xmlns:a14="http://schemas.microsoft.com/office/drawing/2010/main" val="0"/>
+                        </a:ext>
+                      </a:extLst>
+                    </a:blip>
+                    <a:stretch>
+                      <a:fillRect/>
+                    </a:stretch>
+                  </pic:blipFill>
+                  <pic:spPr>
+                    <a:xfrm>
+                      <a:off x="0" y="0"/>
+                      <a:ext cx="5943600" cy="3027045"/>
+                    </a:xfrm>
+                    <a:prstGeom prst="rect">
+                      <a:avLst/>
+                    </a:prstGeom>
+                  </pic:spPr>
+                </pic:pic>
+              </a:graphicData>
+            </a:graphic>
+          </wp:anchor>
+        </w:drawing>
+      </w:r>
+      <w:r>
+        <w:t>Example</w:t>
+      </w:r>
+      <w:r>
+        <w:t xml:space="preserve"> of</w:t>
+      </w:r>
+      <w:r>
+        <w:t xml:space="preserve"> interface:</w:t>
+      </w:r>
+    </w:p>
+    <w:p>
+      <w:pPr>
+        <w:ind w:left="344"/>
+        <w:jc w:val="both"/>
+      </w:pPr>
+      <w:r>
+        <w:t>Overview: This is a generic interface, which has the purpose of being reused by the different resources that are going to have a GRUD operations</w:t>
+      </w:r>
+      <w:r>
+        <w:t xml:space="preserve">. All the methods are asynchronous </w:t>
+      </w:r>
+      <w:proofErr w:type="gramStart"/>
+      <w:r>
+        <w:t>in order to</w:t>
+      </w:r>
+      <w:proofErr w:type="gramEnd"/>
+      <w:r>
+        <w:t xml:space="preserve"> prevent processes blocking, where the argument that accept is either a generic key (</w:t>
+      </w:r>
+      <w:proofErr w:type="spellStart"/>
+      <w:r>
+        <w:t>TKey</w:t>
+      </w:r>
+      <w:proofErr w:type="spellEnd"/>
+      <w:r>
+        <w:t>) or a T object which is constrained to type class.</w:t>
+      </w:r>
+    </w:p>
+    <w:p>
+      <w:pPr>
+        <w:ind w:left="344"/>
+        <w:jc w:val="both"/>
+      </w:pPr>
+    </w:p>
+    <w:p>
+      <w:pPr>
+        <w:ind w:left="344"/>
+        <w:jc w:val="both"/>
+      </w:pPr>
+      <w:r>
+        <w:rPr>
+          <w:noProof/>
+        </w:rPr>
+        <mc:AlternateContent>
+          <mc:Choice Requires="wps">
+            <w:drawing>
+              <wp:anchor distT="0" distB="0" distL="114300" distR="114300" simplePos="0" relativeHeight="251673600" behindDoc="0" locked="0" layoutInCell="1" allowOverlap="1" wp14:anchorId="2D3B2450" wp14:editId="78DAEB45">
+                <wp:simplePos x="0" y="0"/>
+                <wp:positionH relativeFrom="column">
+                  <wp:posOffset>179070</wp:posOffset>
+                </wp:positionH>
+                <wp:positionV relativeFrom="paragraph">
+                  <wp:posOffset>1353185</wp:posOffset>
+                </wp:positionV>
+                <wp:extent cx="4822190" cy="635"/>
+                <wp:effectExtent l="0" t="0" r="0" b="0"/>
+                <wp:wrapTopAndBottom/>
+                <wp:docPr id="1878782720" name="Text Box 1"/>
+                <wp:cNvGraphicFramePr/>
+                <a:graphic xmlns:a="http://schemas.openxmlformats.org/drawingml/2006/main">
+                  <a:graphicData uri="http://schemas.microsoft.com/office/word/2010/wordprocessingShape">
+                    <wps:wsp>
+                      <wps:cNvSpPr txBox="1"/>
+                      <wps:spPr>
+                        <a:xfrm>
+                          <a:off x="0" y="0"/>
+                          <a:ext cx="4822190" cy="635"/>
+                        </a:xfrm>
+                        <a:prstGeom prst="rect">
+                          <a:avLst/>
+                        </a:prstGeom>
+                        <a:solidFill>
+                          <a:prstClr val="white"/>
+                        </a:solidFill>
+                        <a:ln>
+                          <a:noFill/>
+                        </a:ln>
+                      </wps:spPr>
+                      <wps:txbx>
+                        <w:txbxContent>
+                          <w:p>
+                            <w:pPr>
+                              <w:pStyle w:val="Caption"/>
+                              <w:jc w:val="center"/>
+                              <w:rPr>
+                                <w:noProof/>
+                                <w:sz w:val="20"/>
+                                <w:szCs w:val="20"/>
+                              </w:rPr>
+                            </w:pPr>
+                            <w:r>
+                              <w:t xml:space="preserve">Figure </w:t>
+                            </w:r>
+                            <w:r>
+                              <w:fldChar w:fldCharType="begin"/>
+                            </w:r>
+                            <w:r>
+                              <w:instrText xml:space="preserve"> SEQ Figure \* ARABIC </w:instrText>
+                            </w:r>
+                            <w:r>
+                              <w:fldChar w:fldCharType="separate"/>
+                            </w:r>
+                            <w:r>
+                              <w:rPr>
+                                <w:noProof/>
+                              </w:rPr>
+                              <w:t>6</w:t>
+                            </w:r>
+                            <w:r>
+                              <w:fldChar w:fldCharType="end"/>
+                            </w:r>
+                            <w:r>
+                              <w:t xml:space="preserve">: </w:t>
+                            </w:r>
+                            <w:proofErr w:type="spellStart"/>
+                            <w:r>
+                              <w:t>DBConnection</w:t>
+                            </w:r>
+                            <w:proofErr w:type="spellEnd"/>
+                            <w:r>
+                              <w:t xml:space="preserve"> </w:t>
+                            </w:r>
+                            <w:r>
+                              <w:t>helper class</w:t>
+                            </w:r>
+                          </w:p>
+                        </w:txbxContent>
+                      </wps:txbx>
+                      <wps:bodyPr rot="0" spcFirstLastPara="0" vertOverflow="overflow" horzOverflow="overflow" vert="horz" wrap="square" lIns="0" tIns="0" rIns="0" bIns="0" numCol="1" spcCol="0" rtlCol="0" fromWordArt="0" anchor="t" anchorCtr="0" forceAA="0" compatLnSpc="1">
+                        <a:prstTxWarp prst="textNoShape">
+                          <a:avLst/>
+                        </a:prstTxWarp>
+                        <a:spAutoFit/>
+                      </wps:bodyPr>
+                    </wps:wsp>
+                  </a:graphicData>
+                </a:graphic>
+              </wp:anchor>
+            </w:drawing>
+          </mc:Choice>
+          <mc:Fallback>
+            <w:pict>
+              <v:shape w14:anchorId="2D3B2450" id="_x0000_s1030" type="#_x0000_t202" style="position:absolute;left:0;text-align:left;margin-left:14.1pt;margin-top:106.55pt;width:379.7pt;height:.05pt;z-index:251673600;visibility:visible;mso-wrap-style:square;mso-wrap-distance-left:9pt;mso-wrap-distance-top:0;mso-wrap-distance-right:9pt;mso-wrap-distance-bottom:0;mso-position-horizontal:absolute;mso-position-horizontal-relative:text;mso-position-vertical:absolute;mso-position-vertical-relative:text;v-text-anchor:top" o:gfxdata="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" stroked="f">
+                <v:textbox style="mso-fit-shape-to-text:t" inset="0,0,0,0">
+                  <w:txbxContent>
+                    <w:p>
+                      <w:pPr>
+                        <w:pStyle w:val="Caption"/>
+                        <w:jc w:val="center"/>
+                        <w:rPr>
+                          <w:noProof/>
+                          <w:sz w:val="20"/>
+                          <w:szCs w:val="20"/>
+                        </w:rPr>
+                      </w:pPr>
+                      <w:r>
+                        <w:t xml:space="preserve">Figure </w:t>
+                      </w:r>
+                      <w:r>
+                        <w:fldChar w:fldCharType="begin"/>
+                      </w:r>
+                      <w:r>
+                        <w:instrText xml:space="preserve"> SEQ Figure \* ARABIC </w:instrText>
+                      </w:r>
+                      <w:r>
+                        <w:fldChar w:fldCharType="separate"/>
+                      </w:r>
+                      <w:r>
+                        <w:rPr>
+                          <w:noProof/>
+                        </w:rPr>
+                        <w:t>6</w:t>
+                      </w:r>
+                      <w:r>
+                        <w:fldChar w:fldCharType="end"/>
+                      </w:r>
+                      <w:r>
+                        <w:t xml:space="preserve">: </w:t>
+                      </w:r>
+                      <w:proofErr w:type="spellStart"/>
+                      <w:r>
+                        <w:t>DBConnection</w:t>
+                      </w:r>
+                      <w:proofErr w:type="spellEnd"/>
+                      <w:r>
+                        <w:t xml:space="preserve"> </w:t>
+                      </w:r>
+                      <w:r>
+                        <w:t>helper class</w:t>
+                      </w:r>
+                    </w:p>
+                  </w:txbxContent>
+                </v:textbox>
+                <w10:wrap type="topAndBottom"/>
+              </v:shape>
+            </w:pict>
+          </mc:Fallback>
+        </mc:AlternateContent>
+      </w:r>
+      <w:r>
+        <w:rPr>
+          <w:noProof/>
+          <w14:ligatures w14:val="standardContextual"/>
+        </w:rPr>
+        <w:drawing>
+          <wp:anchor distT="0" distB="0" distL="114300" distR="114300" simplePos="0" relativeHeight="251671552" behindDoc="0" locked="0" layoutInCell="1" allowOverlap="1" wp14:anchorId="7C7DC1DD" wp14:editId="3C6BC0DD">
+            <wp:simplePos x="0" y="0"/>
+            <wp:positionH relativeFrom="column">
+              <wp:posOffset>179251</wp:posOffset>
+            </wp:positionH>
+            <wp:positionV relativeFrom="paragraph">
+              <wp:posOffset>221525</wp:posOffset>
+            </wp:positionV>
+            <wp:extent cx="4822190" cy="1388110"/>
+            <wp:effectExtent l="0" t="0" r="0" b="2540"/>
+            <wp:wrapTopAndBottom/>
+            <wp:docPr id="567369336" name="Picture 1"/>
+            <wp:cNvGraphicFramePr>
+              <a:graphicFrameLocks xmlns:a="http://schemas.openxmlformats.org/drawingml/2006/main" noChangeAspect="1"/>
+            </wp:cNvGraphicFramePr>
+            <a:graphic xmlns:a="http://schemas.openxmlformats.org/drawingml/2006/main">
+              <a:graphicData uri="http://schemas.openxmlformats.org/drawingml/2006/picture">
+                <pic:pic xmlns:pic="http://schemas.openxmlformats.org/drawingml/2006/picture">
+                  <pic:nvPicPr>
+                    <pic:cNvPr id="567369336" name=""/>
+                    <pic:cNvPicPr/>
+                  </pic:nvPicPr>
+                  <pic:blipFill>
+                    <a:blip r:embed="rId11" cstate="print">
+                      <a:extLst>
+                        <a:ext uri="{28A0092B-C50C-407E-A947-70E740481C1C}">
+                          <a14:useLocalDpi xmlns:a14="http://schemas.microsoft.com/office/drawing/2010/main" val="0"/>
+                        </a:ext>
+                      </a:extLst>
+                    </a:blip>
+                    <a:stretch>
+                      <a:fillRect/>
+                    </a:stretch>
+                  </pic:blipFill>
+                  <pic:spPr>
+                    <a:xfrm>
+                      <a:off x="0" y="0"/>
+                      <a:ext cx="4822190" cy="1388110"/>
+                    </a:xfrm>
+                    <a:prstGeom prst="rect">
+                      <a:avLst/>
+                    </a:prstGeom>
+                  </pic:spPr>
+                </pic:pic>
+              </a:graphicData>
+            </a:graphic>
+            <wp14:sizeRelH relativeFrom="margin">
+              <wp14:pctWidth>0</wp14:pctWidth>
+            </wp14:sizeRelH>
+            <wp14:sizeRelV relativeFrom="margin">
+              <wp14:pctHeight>0</wp14:pctHeight>
+            </wp14:sizeRelV>
+          </wp:anchor>
+        </w:drawing>
+      </w:r>
+      <w:r>
+        <w:t>Database connection file</w:t>
+      </w:r>
+      <w:r>
+        <w:t>:</w:t>
+      </w:r>
+    </w:p>
+    <w:p>
+      <w:pPr>
+        <w:ind w:left="344"/>
+        <w:jc w:val="both"/>
+      </w:pPr>
+      <w:r>
+        <w:lastRenderedPageBreak/>
+        <w:t xml:space="preserve">Overview: A custom helper class, containing only one method for getting the connection string from the </w:t>
+      </w:r>
+      <w:proofErr w:type="spellStart"/>
+      <w:proofErr w:type="gramStart"/>
+      <w:r>
+        <w:t>appsettings.json</w:t>
+      </w:r>
+      <w:proofErr w:type="spellEnd"/>
+      <w:proofErr w:type="gramEnd"/>
+      <w:r>
+        <w:t xml:space="preserve"> configuration file and returning a connection instance, which could be used by certain resource (opening the database connection &amp; closing it).</w:t>
+      </w:r>
+    </w:p>
+    <w:p>
+      <w:pPr>
+        <w:ind w:left="344"/>
+        <w:jc w:val="both"/>
+      </w:pPr>
+    </w:p>
+    <w:p>
+      <w:pPr>
+        <w:ind w:left="344"/>
+        <w:jc w:val="both"/>
+      </w:pPr>
+      <w:r>
+        <w:rPr>
+          <w:noProof/>
+        </w:rPr>
+        <mc:AlternateContent>
+          <mc:Choice Requires="wps">
+            <w:drawing>
+              <wp:anchor distT="0" distB="0" distL="114300" distR="114300" simplePos="0" relativeHeight="251676672" behindDoc="0" locked="0" layoutInCell="1" allowOverlap="1" wp14:anchorId="22EEF654" wp14:editId="213E4E54">
+                <wp:simplePos x="0" y="0"/>
+                <wp:positionH relativeFrom="column">
+                  <wp:posOffset>219075</wp:posOffset>
+                </wp:positionH>
+                <wp:positionV relativeFrom="paragraph">
+                  <wp:posOffset>2851785</wp:posOffset>
+                </wp:positionV>
+                <wp:extent cx="4722495" cy="635"/>
+                <wp:effectExtent l="0" t="0" r="0" b="0"/>
+                <wp:wrapTopAndBottom/>
+                <wp:docPr id="35729794" name="Text Box 1"/>
+                <wp:cNvGraphicFramePr/>
+                <a:graphic xmlns:a="http://schemas.openxmlformats.org/drawingml/2006/main">
+                  <a:graphicData uri="http://schemas.microsoft.com/office/word/2010/wordprocessingShape">
+                    <wps:wsp>
+                      <wps:cNvSpPr txBox="1"/>
+                      <wps:spPr>
+                        <a:xfrm>
+                          <a:off x="0" y="0"/>
+                          <a:ext cx="4722495" cy="635"/>
+                        </a:xfrm>
+                        <a:prstGeom prst="rect">
+                          <a:avLst/>
+                        </a:prstGeom>
+                        <a:solidFill>
+                          <a:prstClr val="white"/>
+                        </a:solidFill>
+                        <a:ln>
+                          <a:noFill/>
+                        </a:ln>
+                      </wps:spPr>
+                      <wps:txbx>
+                        <w:txbxContent>
+                          <w:p>
+                            <w:pPr>
+                              <w:pStyle w:val="Caption"/>
+                              <w:jc w:val="center"/>
+                              <w:rPr>
+                                <w:lang w:val="en-US"/>
+                              </w:rPr>
+                            </w:pPr>
+                            <w:r>
+                              <w:t xml:space="preserve">Figure </w:t>
+                            </w:r>
+                            <w:r>
+                              <w:fldChar w:fldCharType="begin"/>
+                            </w:r>
+                            <w:r>
+                              <w:instrText xml:space="preserve"> SEQ Figure \* ARABIC </w:instrText>
+                            </w:r>
+                            <w:r>
+                              <w:fldChar w:fldCharType="separate"/>
+                            </w:r>
+                            <w:r>
+                              <w:rPr>
+                                <w:noProof/>
+                              </w:rPr>
+                              <w:t>7</w:t>
+                            </w:r>
+                            <w:r>
+                              <w:fldChar w:fldCharType="end"/>
+                            </w:r>
+                            <w:r>
+                              <w:t xml:space="preserve">: </w:t>
+                            </w:r>
+                            <w:proofErr w:type="spellStart"/>
+                            <w:r>
+                              <w:rPr>
+                                <w:lang w:val="en-US"/>
+                              </w:rPr>
+                              <w:t>CarRepository</w:t>
+                            </w:r>
+                            <w:proofErr w:type="spellEnd"/>
+                            <w:r>
+                              <w:rPr>
+                                <w:lang w:val="en-US"/>
+                              </w:rPr>
+                              <w:t xml:space="preserve"> – </w:t>
+                            </w:r>
+                            <w:proofErr w:type="spellStart"/>
+                            <w:proofErr w:type="gramStart"/>
+                            <w:r>
+                              <w:rPr>
+                                <w:lang w:val="en-US"/>
+                              </w:rPr>
+                              <w:t>GetAllAsync</w:t>
+                            </w:r>
+                            <w:proofErr w:type="spellEnd"/>
+                            <w:r>
+                              <w:rPr>
+                                <w:lang w:val="en-US"/>
+                              </w:rPr>
+                              <w:t>(</w:t>
+                            </w:r>
+                            <w:proofErr w:type="gramEnd"/>
+                            <w:r>
+                              <w:rPr>
+                                <w:lang w:val="en-US"/>
+                              </w:rPr>
+                              <w:t>) method</w:t>
+                            </w:r>
+                          </w:p>
+                        </w:txbxContent>
+                      </wps:txbx>
+                      <wps:bodyPr rot="0" spcFirstLastPara="0" vertOverflow="overflow" horzOverflow="overflow" vert="horz" wrap="square" lIns="0" tIns="0" rIns="0" bIns="0" numCol="1" spcCol="0" rtlCol="0" fromWordArt="0" anchor="t" anchorCtr="0" forceAA="0" compatLnSpc="1">
+                        <a:prstTxWarp prst="textNoShape">
+                          <a:avLst/>
+                        </a:prstTxWarp>
+                        <a:spAutoFit/>
+                      </wps:bodyPr>
+                    </wps:wsp>
+                  </a:graphicData>
+                </a:graphic>
+              </wp:anchor>
+            </w:drawing>
+          </mc:Choice>
+          <mc:Fallback>
+            <w:pict>
+              <v:shape w14:anchorId="22EEF654" id="_x0000_s1031" type="#_x0000_t202" style="position:absolute;left:0;text-align:left;margin-left:17.25pt;margin-top:224.55pt;width:371.85pt;height:.05pt;z-index:251676672;visibility:visible;mso-wrap-style:square;mso-wrap-distance-left:9pt;mso-wrap-distance-top:0;mso-wrap-distance-right:9pt;mso-wrap-distance-bottom:0;mso-position-horizontal:absolute;mso-position-horizontal-relative:text;mso-position-vertical:absolute;mso-position-vertical-relative:text;v-text-anchor:top" o:gfxdata="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" stroked="f">
+                <v:textbox style="mso-fit-shape-to-text:t" inset="0,0,0,0">
+                  <w:txbxContent>
+                    <w:p>
+                      <w:pPr>
+                        <w:pStyle w:val="Caption"/>
+                        <w:jc w:val="center"/>
+                        <w:rPr>
+                          <w:lang w:val="en-US"/>
+                        </w:rPr>
+                      </w:pPr>
+                      <w:r>
+                        <w:t xml:space="preserve">Figure </w:t>
+                      </w:r>
+                      <w:r>
+                        <w:fldChar w:fldCharType="begin"/>
+                      </w:r>
+                      <w:r>
+                        <w:instrText xml:space="preserve"> SEQ Figure \* ARABIC </w:instrText>
+                      </w:r>
+                      <w:r>
+                        <w:fldChar w:fldCharType="separate"/>
+                      </w:r>
+                      <w:r>
+                        <w:rPr>
+                          <w:noProof/>
+                        </w:rPr>
+                        <w:t>7</w:t>
+                      </w:r>
+                      <w:r>
+                        <w:fldChar w:fldCharType="end"/>
+                      </w:r>
+                      <w:r>
+                        <w:t xml:space="preserve">: </w:t>
+                      </w:r>
+                      <w:proofErr w:type="spellStart"/>
+                      <w:r>
+                        <w:rPr>
+                          <w:lang w:val="en-US"/>
+                        </w:rPr>
+                        <w:t>CarRepository</w:t>
+                      </w:r>
+                      <w:proofErr w:type="spellEnd"/>
+                      <w:r>
+                        <w:rPr>
+                          <w:lang w:val="en-US"/>
+                        </w:rPr>
+                        <w:t xml:space="preserve"> – </w:t>
+                      </w:r>
+                      <w:proofErr w:type="spellStart"/>
+                      <w:proofErr w:type="gramStart"/>
+                      <w:r>
+                        <w:rPr>
+                          <w:lang w:val="en-US"/>
+                        </w:rPr>
+                        <w:t>GetAllAsync</w:t>
+                      </w:r>
+                      <w:proofErr w:type="spellEnd"/>
+                      <w:r>
+                        <w:rPr>
+                          <w:lang w:val="en-US"/>
+                        </w:rPr>
+                        <w:t>(</w:t>
+                      </w:r>
+                      <w:proofErr w:type="gramEnd"/>
+                      <w:r>
+                        <w:rPr>
+                          <w:lang w:val="en-US"/>
+                        </w:rPr>
+                        <w:t>) method</w:t>
+                      </w:r>
+                    </w:p>
+                  </w:txbxContent>
+                </v:textbox>
+                <w10:wrap type="topAndBottom"/>
+              </v:shape>
+            </w:pict>
+          </mc:Fallback>
+        </mc:AlternateContent>
+      </w:r>
+      <w:r>
+        <w:rPr>
+          <w:noProof/>
+          <w14:ligatures w14:val="standardContextual"/>
+        </w:rPr>
+        <w:drawing>
+          <wp:anchor distT="0" distB="0" distL="114300" distR="114300" simplePos="0" relativeHeight="251674624" behindDoc="0" locked="0" layoutInCell="1" allowOverlap="1" wp14:anchorId="44FA47FB" wp14:editId="44660604">
+            <wp:simplePos x="0" y="0"/>
+            <wp:positionH relativeFrom="column">
+              <wp:posOffset>219075</wp:posOffset>
+            </wp:positionH>
+            <wp:positionV relativeFrom="paragraph">
+              <wp:posOffset>245745</wp:posOffset>
+            </wp:positionV>
+            <wp:extent cx="4722495" cy="2548890"/>
+            <wp:effectExtent l="0" t="0" r="1905" b="3810"/>
+            <wp:wrapTopAndBottom/>
+            <wp:docPr id="48556182" name="Picture 1"/>
+            <wp:cNvGraphicFramePr>
+              <a:graphicFrameLocks xmlns:a="http://schemas.openxmlformats.org/drawingml/2006/main" noChangeAspect="1"/>
+            </wp:cNvGraphicFramePr>
+            <a:graphic xmlns:a="http://schemas.openxmlformats.org/drawingml/2006/main">
+              <a:graphicData uri="http://schemas.openxmlformats.org/drawingml/2006/picture">
+                <pic:pic xmlns:pic="http://schemas.openxmlformats.org/drawingml/2006/picture">
+                  <pic:nvPicPr>
+                    <pic:cNvPr id="48556182" name=""/>
+                    <pic:cNvPicPr/>
+                  </pic:nvPicPr>
+                  <pic:blipFill>
+                    <a:blip r:embed="rId12">
+                      <a:extLst>
+                        <a:ext uri="{28A0092B-C50C-407E-A947-70E740481C1C}">
+                          <a14:useLocalDpi xmlns:a14="http://schemas.microsoft.com/office/drawing/2010/main" val="0"/>
+                        </a:ext>
+                      </a:extLst>
+                    </a:blip>
+                    <a:stretch>
+                      <a:fillRect/>
+                    </a:stretch>
+                  </pic:blipFill>
+                  <pic:spPr>
+                    <a:xfrm>
+                      <a:off x="0" y="0"/>
+                      <a:ext cx="4722495" cy="2548890"/>
+                    </a:xfrm>
+                    <a:prstGeom prst="rect">
+                      <a:avLst/>
+                    </a:prstGeom>
+                  </pic:spPr>
+                </pic:pic>
+              </a:graphicData>
+            </a:graphic>
+            <wp14:sizeRelH relativeFrom="margin">
+              <wp14:pctWidth>0</wp14:pctWidth>
+            </wp14:sizeRelH>
+            <wp14:sizeRelV relativeFrom="margin">
+              <wp14:pctHeight>0</wp14:pctHeight>
+            </wp14:sizeRelV>
+          </wp:anchor>
+        </w:drawing>
+      </w:r>
+      <w:r>
+        <w:t>Example of a repository:</w:t>
+      </w:r>
+    </w:p>
+    <w:p>
+      <w:pPr>
+        <w:ind w:left="344"/>
+        <w:jc w:val="both"/>
+        <w:rPr>
+          <w:sz w:val="22"/>
+          <w:szCs w:val="22"/>
+        </w:rPr>
+      </w:pPr>
+      <w:r>
+        <w:rPr>
+          <w:sz w:val="22"/>
+          <w:szCs w:val="22"/>
+        </w:rPr>
+        <w:t>Overview: The repository implements the given method (</w:t>
+      </w:r>
+      <w:proofErr w:type="spellStart"/>
+      <w:r>
+        <w:rPr>
+          <w:b/>
+          <w:bCs/>
+          <w:sz w:val="22"/>
+          <w:szCs w:val="22"/>
+        </w:rPr>
+        <w:t>GetAllAsync</w:t>
+      </w:r>
+      <w:proofErr w:type="spellEnd"/>
+      <w:r>
+        <w:rPr>
+          <w:sz w:val="22"/>
+          <w:szCs w:val="22"/>
+        </w:rPr>
+        <w:t>) from the interface by first opening a instance of the database (see fig. 6), defines a SQL query (in this example select the first 3 records from table Cars), then assign the result to a list, commit the query statement and finally bind the data to models fields.</w:t>
+      </w:r>
+    </w:p>
+    <w:p>
+      <w:pPr>
+        <w:spacing w:line="360" w:lineRule="auto"/>
+        <w:ind w:left="227" w:right="227"/>
+        <w:rPr>
+          <w:b/>
+          <w:bCs/>
+        </w:rPr>
+      </w:pPr>
+    </w:p>
+    <w:p>
+      <w:pPr>
+        <w:spacing w:line="360" w:lineRule="auto"/>
+        <w:ind w:left="227" w:right="227"/>
+        <w:rPr>
+          <w:u w:val="single"/>
+        </w:rPr>
+      </w:pPr>
+      <w:r>
+        <w:rPr>
+          <w:u w:val="single"/>
+        </w:rPr>
+        <w:t>BLL directory</w:t>
+      </w:r>
+    </w:p>
+    <w:p>
+      <w:pPr>
+        <w:spacing w:line="360" w:lineRule="auto"/>
+        <w:ind w:left="227" w:right="227"/>
+      </w:pPr>
+      <w:r>
+        <w:rPr>
+          <w:noProof/>
+        </w:rPr>
+        <mc:AlternateContent>
+          <mc:Choice Requires="wps">
+            <w:drawing>
+              <wp:anchor distT="0" distB="0" distL="114300" distR="114300" simplePos="0" relativeHeight="251679744" behindDoc="0" locked="0" layoutInCell="1" allowOverlap="1" wp14:anchorId="589E4D36" wp14:editId="3EA21C7F">
+                <wp:simplePos x="0" y="0"/>
+                <wp:positionH relativeFrom="column">
+                  <wp:posOffset>144780</wp:posOffset>
+                </wp:positionH>
+                <wp:positionV relativeFrom="paragraph">
+                  <wp:posOffset>1249045</wp:posOffset>
+                </wp:positionV>
+                <wp:extent cx="2880360" cy="635"/>
+                <wp:effectExtent l="0" t="0" r="0" b="0"/>
+                <wp:wrapTopAndBottom/>
+                <wp:docPr id="940404466" name="Text Box 1"/>
+                <wp:cNvGraphicFramePr/>
+                <a:graphic xmlns:a="http://schemas.openxmlformats.org/drawingml/2006/main">
+                  <a:graphicData uri="http://schemas.microsoft.com/office/word/2010/wordprocessingShape">
+                    <wps:wsp>
+                      <wps:cNvSpPr txBox="1"/>
+                      <wps:spPr>
+                        <a:xfrm>
+                          <a:off x="0" y="0"/>
+                          <a:ext cx="2880360" cy="635"/>
+                        </a:xfrm>
+                        <a:prstGeom prst="rect">
+                          <a:avLst/>
+                        </a:prstGeom>
+                        <a:solidFill>
+                          <a:prstClr val="white"/>
+                        </a:solidFill>
+                        <a:ln>
+                          <a:noFill/>
+                        </a:ln>
+                      </wps:spPr>
+                      <wps:txbx>
+                        <w:txbxContent>
+                          <w:p>
+                            <w:pPr>
+                              <w:pStyle w:val="Caption"/>
+                              <w:jc w:val="center"/>
+                              <w:rPr>
+                                <w:noProof/>
+                                <w:sz w:val="20"/>
+                                <w:szCs w:val="20"/>
+                              </w:rPr>
+                            </w:pPr>
+                            <w:r>
+                              <w:t xml:space="preserve">Figure </w:t>
+                            </w:r>
+                            <w:r>
+                              <w:fldChar w:fldCharType="begin"/>
+                            </w:r>
+                            <w:r>
+                              <w:instrText xml:space="preserve"> SEQ Figure \* ARABIC </w:instrText>
+                            </w:r>
+                            <w:r>
+                              <w:fldChar w:fldCharType="separate"/>
+                            </w:r>
+                            <w:r>
+                              <w:rPr>
+                                <w:noProof/>
+                              </w:rPr>
+                              <w:t>8</w:t>
+                            </w:r>
+                            <w:r>
+                              <w:fldChar w:fldCharType="end"/>
+                            </w:r>
+                            <w:r>
+                              <w:t>: BLL directory snapshot</w:t>
+                            </w:r>
+                          </w:p>
+                        </w:txbxContent>
+                      </wps:txbx>
+                      <wps:bodyPr rot="0" spcFirstLastPara="0" vertOverflow="overflow" horzOverflow="overflow" vert="horz" wrap="square" lIns="0" tIns="0" rIns="0" bIns="0" numCol="1" spcCol="0" rtlCol="0" fromWordArt="0" anchor="t" anchorCtr="0" forceAA="0" compatLnSpc="1">
+                        <a:prstTxWarp prst="textNoShape">
+                          <a:avLst/>
+                        </a:prstTxWarp>
+                        <a:spAutoFit/>
+                      </wps:bodyPr>
+                    </wps:wsp>
+                  </a:graphicData>
+                </a:graphic>
+              </wp:anchor>
+            </w:drawing>
+          </mc:Choice>
+          <mc:Fallback>
+            <w:pict>
+              <v:shape w14:anchorId="589E4D36" id="_x0000_s1032" type="#_x0000_t202" style="position:absolute;left:0;text-align:left;margin-left:11.4pt;margin-top:98.35pt;width:226.8pt;height:.05pt;z-index:251679744;visibility:visible;mso-wrap-style:square;mso-wrap-distance-left:9pt;mso-wrap-distance-top:0;mso-wrap-distance-right:9pt;mso-wrap-distance-bottom:0;mso-position-horizontal:absolute;mso-position-horizontal-relative:text;mso-position-vertical:absolute;mso-position-vertical-relative:text;v-text-anchor:top" o:gfxdata="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" stroked="f">
+                <v:textbox style="mso-fit-shape-to-text:t" inset="0,0,0,0">
+                  <w:txbxContent>
+                    <w:p>
+                      <w:pPr>
+                        <w:pStyle w:val="Caption"/>
+                        <w:jc w:val="center"/>
+                        <w:rPr>
+                          <w:noProof/>
+                          <w:sz w:val="20"/>
+                          <w:szCs w:val="20"/>
+                        </w:rPr>
+                      </w:pPr>
+                      <w:r>
+                        <w:t xml:space="preserve">Figure </w:t>
+                      </w:r>
+                      <w:r>
+                        <w:fldChar w:fldCharType="begin"/>
+                      </w:r>
+                      <w:r>
+                        <w:instrText xml:space="preserve"> SEQ Figure \* ARABIC </w:instrText>
+                      </w:r>
+                      <w:r>
+                        <w:fldChar w:fldCharType="separate"/>
+                      </w:r>
+                      <w:r>
+                        <w:rPr>
+                          <w:noProof/>
+                        </w:rPr>
+                        <w:t>8</w:t>
+                      </w:r>
+                      <w:r>
+                        <w:fldChar w:fldCharType="end"/>
+                      </w:r>
+                      <w:r>
+                        <w:t>: BLL directory snapshot</w:t>
+                      </w:r>
+                    </w:p>
+                  </w:txbxContent>
+                </v:textbox>
+                <w10:wrap type="topAndBottom"/>
+              </v:shape>
+            </w:pict>
+          </mc:Fallback>
+        </mc:AlternateContent>
+      </w:r>
+      <w:r>
+        <w:rPr>
+          <w:noProof/>
+          <w14:ligatures w14:val="standardContextual"/>
+        </w:rPr>
+        <w:drawing>
+          <wp:anchor distT="0" distB="0" distL="114300" distR="114300" simplePos="0" relativeHeight="251677696" behindDoc="0" locked="0" layoutInCell="1" allowOverlap="1" wp14:anchorId="0FAC9A80" wp14:editId="3B14A007">
+            <wp:simplePos x="0" y="0"/>
+            <wp:positionH relativeFrom="column">
+              <wp:posOffset>144780</wp:posOffset>
+            </wp:positionH>
+            <wp:positionV relativeFrom="paragraph">
+              <wp:posOffset>2540</wp:posOffset>
+            </wp:positionV>
+            <wp:extent cx="2880360" cy="1189355"/>
+            <wp:effectExtent l="0" t="0" r="0" b="0"/>
+            <wp:wrapTopAndBottom/>
+            <wp:docPr id="158841304" name="Picture 1"/>
+            <wp:cNvGraphicFramePr>
+              <a:graphicFrameLocks xmlns:a="http://schemas.openxmlformats.org/drawingml/2006/main" noChangeAspect="1"/>
+            </wp:cNvGraphicFramePr>
+            <a:graphic xmlns:a="http://schemas.openxmlformats.org/drawingml/2006/main">
+              <a:graphicData uri="http://schemas.openxmlformats.org/drawingml/2006/picture">
+                <pic:pic xmlns:pic="http://schemas.openxmlformats.org/drawingml/2006/picture">
+                  <pic:nvPicPr>
+                    <pic:cNvPr id="158841304" name=""/>
+                    <pic:cNvPicPr/>
+                  </pic:nvPicPr>
+                  <pic:blipFill>
+                    <a:blip r:embed="rId13">
+                      <a:extLst>
+                        <a:ext uri="{28A0092B-C50C-407E-A947-70E740481C1C}">
+                          <a14:useLocalDpi xmlns:a14="http://schemas.microsoft.com/office/drawing/2010/main" val="0"/>
+                        </a:ext>
+                      </a:extLst>
+                    </a:blip>
+                    <a:stretch>
+                      <a:fillRect/>
+                    </a:stretch>
+                  </pic:blipFill>
+                  <pic:spPr>
+                    <a:xfrm>
+                      <a:off x="0" y="0"/>
+                      <a:ext cx="2880360" cy="1189355"/>
+                    </a:xfrm>
+                    <a:prstGeom prst="rect">
+                      <a:avLst/>
+                    </a:prstGeom>
+                  </pic:spPr>
+                </pic:pic>
+              </a:graphicData>
+            </a:graphic>
+          </wp:anchor>
+        </w:drawing>
+      </w:r>
+      <w:r>
+        <w:t>Under</w:t>
+      </w:r>
+      <w:r>
+        <w:t xml:space="preserve"> folder </w:t>
+      </w:r>
+      <w:r>
+        <w:rPr>
+          <w:b/>
+          <w:bCs/>
+        </w:rPr>
+        <w:t>Services</w:t>
+      </w:r>
+      <w:r>
+        <w:rPr>
+          <w:b/>
+          <w:bCs/>
+        </w:rPr>
+        <w:t xml:space="preserve"> </w:t>
+      </w:r>
+      <w:r>
+        <w:t>is locat</w:t>
+      </w:r>
+      <w:r>
+        <w:t>ed the business logic of the application, later those services are injected (firstly in the DI container) into a given page model through a constructor.</w:t>
+      </w:r>
+    </w:p>
+    <w:p>
+      <w:pPr>
+        <w:spacing w:line="360" w:lineRule="auto"/>
+        <w:ind w:left="227" w:right="227"/>
+      </w:pPr>
+    </w:p>
+    <w:p>
+      <w:pPr>
+        <w:spacing w:line="360" w:lineRule="auto"/>
+        <w:ind w:left="227" w:right="227"/>
+      </w:pPr>
+      <w:r>
+        <w:t>Example of a service:</w:t>
+      </w:r>
+    </w:p>
+    <w:p>
+      <w:pPr>
+        <w:spacing w:line="360" w:lineRule="auto"/>
+        <w:ind w:left="227" w:right="227"/>
+        <w:rPr>
+          <w:lang w:val="en-US"/>
+        </w:rPr>
+      </w:pPr>
+      <w:r>
+        <w:rPr>
+          <w:noProof/>
+        </w:rPr>
+        <w:lastRenderedPageBreak/>
+        <mc:AlternateContent>
+          <mc:Choice Requires="wps">
+            <w:drawing>
+              <wp:anchor distT="0" distB="0" distL="114300" distR="114300" simplePos="0" relativeHeight="251682816" behindDoc="0" locked="0" layoutInCell="1" allowOverlap="1" wp14:anchorId="7B2AA977" wp14:editId="2DA0A1D6">
+                <wp:simplePos x="0" y="0"/>
+                <wp:positionH relativeFrom="column">
+                  <wp:posOffset>142875</wp:posOffset>
+                </wp:positionH>
+                <wp:positionV relativeFrom="paragraph">
+                  <wp:posOffset>3080385</wp:posOffset>
+                </wp:positionV>
+                <wp:extent cx="5686425" cy="635"/>
+                <wp:effectExtent l="0" t="0" r="0" b="0"/>
+                <wp:wrapTopAndBottom/>
+                <wp:docPr id="1802026953" name="Text Box 1"/>
+                <wp:cNvGraphicFramePr/>
+                <a:graphic xmlns:a="http://schemas.openxmlformats.org/drawingml/2006/main">
+                  <a:graphicData uri="http://schemas.microsoft.com/office/word/2010/wordprocessingShape">
+                    <wps:wsp>
+                      <wps:cNvSpPr txBox="1"/>
+                      <wps:spPr>
+                        <a:xfrm>
+                          <a:off x="0" y="0"/>
+                          <a:ext cx="5686425" cy="635"/>
+                        </a:xfrm>
+                        <a:prstGeom prst="rect">
+                          <a:avLst/>
+                        </a:prstGeom>
+                        <a:solidFill>
+                          <a:prstClr val="white"/>
+                        </a:solidFill>
+                        <a:ln>
+                          <a:noFill/>
+                        </a:ln>
+                      </wps:spPr>
+                      <wps:txbx>
+                        <w:txbxContent>
+                          <w:p>
+                            <w:pPr>
+                              <w:pStyle w:val="Caption"/>
+                              <w:jc w:val="center"/>
+                              <w:rPr>
+                                <w:noProof/>
+                                <w:sz w:val="20"/>
+                                <w:szCs w:val="20"/>
+                              </w:rPr>
+                            </w:pPr>
+                            <w:r>
+                              <w:t xml:space="preserve">Figure </w:t>
+                            </w:r>
+                            <w:r>
+                              <w:fldChar w:fldCharType="begin"/>
+                            </w:r>
+                            <w:r>
+                              <w:instrText xml:space="preserve"> SEQ Figure \* ARABIC </w:instrText>
+                            </w:r>
+                            <w:r>
+                              <w:fldChar w:fldCharType="separate"/>
+                            </w:r>
+                            <w:r>
+                              <w:rPr>
+                                <w:noProof/>
+                              </w:rPr>
+                              <w:t>9</w:t>
+                            </w:r>
+                            <w:r>
+                              <w:fldChar w:fldCharType="end"/>
+                            </w:r>
+                            <w:r>
+                              <w:t xml:space="preserve"> Service class: </w:t>
+                            </w:r>
+                            <w:proofErr w:type="spellStart"/>
+                            <w:r>
+                              <w:t>CarService</w:t>
+                            </w:r>
+                            <w:proofErr w:type="spellEnd"/>
+                          </w:p>
+                        </w:txbxContent>
+                      </wps:txbx>
+                      <wps:bodyPr rot="0" spcFirstLastPara="0" vertOverflow="overflow" horzOverflow="overflow" vert="horz" wrap="square" lIns="0" tIns="0" rIns="0" bIns="0" numCol="1" spcCol="0" rtlCol="0" fromWordArt="0" anchor="t" anchorCtr="0" forceAA="0" compatLnSpc="1">
+                        <a:prstTxWarp prst="textNoShape">
+                          <a:avLst/>
+                        </a:prstTxWarp>
+                        <a:spAutoFit/>
+                      </wps:bodyPr>
+                    </wps:wsp>
+                  </a:graphicData>
+                </a:graphic>
+              </wp:anchor>
+            </w:drawing>
+          </mc:Choice>
+          <mc:Fallback>
+            <w:pict>
+              <v:shape w14:anchorId="7B2AA977" id="_x0000_s1033" type="#_x0000_t202" style="position:absolute;left:0;text-align:left;margin-left:11.25pt;margin-top:242.55pt;width:447.75pt;height:.05pt;z-index:251682816;visibility:visible;mso-wrap-style:square;mso-wrap-distance-left:9pt;mso-wrap-distance-top:0;mso-wrap-distance-right:9pt;mso-wrap-distance-bottom:0;mso-position-horizontal:absolute;mso-position-horizontal-relative:text;mso-position-vertical:absolute;mso-position-vertical-relative:text;v-text-anchor:top" o:gfxdata="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" stroked="f">
+                <v:textbox style="mso-fit-shape-to-text:t" inset="0,0,0,0">
+                  <w:txbxContent>
+                    <w:p>
+                      <w:pPr>
+                        <w:pStyle w:val="Caption"/>
+                        <w:jc w:val="center"/>
+                        <w:rPr>
+                          <w:noProof/>
+                          <w:sz w:val="20"/>
+                          <w:szCs w:val="20"/>
+                        </w:rPr>
+                      </w:pPr>
+                      <w:r>
+                        <w:t xml:space="preserve">Figure </w:t>
+                      </w:r>
+                      <w:r>
+                        <w:fldChar w:fldCharType="begin"/>
+                      </w:r>
+                      <w:r>
+                        <w:instrText xml:space="preserve"> SEQ Figure \* ARABIC </w:instrText>
+                      </w:r>
+                      <w:r>
+                        <w:fldChar w:fldCharType="separate"/>
+                      </w:r>
+                      <w:r>
+                        <w:rPr>
+                          <w:noProof/>
+                        </w:rPr>
+                        <w:t>9</w:t>
+                      </w:r>
+                      <w:r>
+                        <w:fldChar w:fldCharType="end"/>
+                      </w:r>
+                      <w:r>
+                        <w:t xml:space="preserve"> Service class: </w:t>
+                      </w:r>
+                      <w:proofErr w:type="spellStart"/>
+                      <w:r>
+                        <w:t>CarService</w:t>
+                      </w:r>
+                      <w:proofErr w:type="spellEnd"/>
+                    </w:p>
+                  </w:txbxContent>
+                </v:textbox>
+                <w10:wrap type="topAndBottom"/>
+              </v:shape>
+            </w:pict>
+          </mc:Fallback>
+        </mc:AlternateContent>
+      </w:r>
+      <w:r>
+        <w:rPr>
+          <w:noProof/>
+          <w14:ligatures w14:val="standardContextual"/>
+        </w:rPr>
+        <w:drawing>
+          <wp:anchor distT="0" distB="0" distL="114300" distR="114300" simplePos="0" relativeHeight="251680768" behindDoc="0" locked="0" layoutInCell="1" allowOverlap="1" wp14:anchorId="21A5EFC5" wp14:editId="077C7F13">
+            <wp:simplePos x="0" y="0"/>
+            <wp:positionH relativeFrom="column">
+              <wp:posOffset>142875</wp:posOffset>
+            </wp:positionH>
+            <wp:positionV relativeFrom="paragraph">
+              <wp:posOffset>0</wp:posOffset>
+            </wp:positionV>
+            <wp:extent cx="5686425" cy="3023235"/>
+            <wp:effectExtent l="0" t="0" r="9525" b="5715"/>
+            <wp:wrapTopAndBottom/>
+            <wp:docPr id="780045604" name="Picture 1"/>
+            <wp:cNvGraphicFramePr>
+              <a:graphicFrameLocks xmlns:a="http://schemas.openxmlformats.org/drawingml/2006/main" noChangeAspect="1"/>
+            </wp:cNvGraphicFramePr>
+            <a:graphic xmlns:a="http://schemas.openxmlformats.org/drawingml/2006/main">
+              <a:graphicData uri="http://schemas.openxmlformats.org/drawingml/2006/picture">
+                <pic:pic xmlns:pic="http://schemas.openxmlformats.org/drawingml/2006/picture">
+                  <pic:nvPicPr>
+                    <pic:cNvPr id="780045604" name=""/>
+                    <pic:cNvPicPr/>
+                  </pic:nvPicPr>
+                  <pic:blipFill>
+                    <a:blip r:embed="rId14">
+                      <a:extLst>
+                        <a:ext uri="{28A0092B-C50C-407E-A947-70E740481C1C}">
+                          <a14:useLocalDpi xmlns:a14="http://schemas.microsoft.com/office/drawing/2010/main" val="0"/>
+                        </a:ext>
+                      </a:extLst>
+                    </a:blip>
+                    <a:stretch>
+                      <a:fillRect/>
+                    </a:stretch>
+                  </pic:blipFill>
+                  <pic:spPr>
+                    <a:xfrm>
+                      <a:off x="0" y="0"/>
+                      <a:ext cx="5686425" cy="3023235"/>
+                    </a:xfrm>
+                    <a:prstGeom prst="rect">
+                      <a:avLst/>
+                    </a:prstGeom>
+                  </pic:spPr>
+                </pic:pic>
+              </a:graphicData>
+            </a:graphic>
+            <wp14:sizeRelH relativeFrom="margin">
+              <wp14:pctWidth>0</wp14:pctWidth>
+            </wp14:sizeRelH>
+            <wp14:sizeRelV relativeFrom="margin">
+              <wp14:pctHeight>0</wp14:pctHeight>
+            </wp14:sizeRelV>
+          </wp:anchor>
+        </w:drawing>
+      </w:r>
+      <w:r>
+        <w:t xml:space="preserve">Overview: Through a constructor, the service accepts interfaces that have their specific implementation (indicated by a key: e.g. </w:t>
+      </w:r>
+      <w:proofErr w:type="spellStart"/>
+      <w:r>
+        <w:t>carsSql</w:t>
+      </w:r>
+      <w:proofErr w:type="spellEnd"/>
+      <w:r>
+        <w:t xml:space="preserve">), which tells he service which implementation is applied. On the figure could be seen one of the methods, which in this case is </w:t>
+      </w:r>
+      <w:proofErr w:type="spellStart"/>
+      <w:proofErr w:type="gramStart"/>
+      <w:r>
+        <w:rPr>
+          <w:lang w:val="en-US"/>
+        </w:rPr>
+        <w:t>GetAllCarsAsync</w:t>
+      </w:r>
+      <w:proofErr w:type="spellEnd"/>
+      <w:r>
+        <w:rPr>
+          <w:lang w:val="en-US"/>
+        </w:rPr>
+        <w:t>(</w:t>
+      </w:r>
+      <w:proofErr w:type="gramEnd"/>
+      <w:r>
+        <w:rPr>
+          <w:lang w:val="en-US"/>
+        </w:rPr>
+        <w:t>)</w:t>
+      </w:r>
+      <w:r>
+        <w:rPr>
+          <w:lang w:val="en-US"/>
+        </w:rPr>
+        <w:t xml:space="preserve"> who basically returns a fetched list of cars as a response (see Fig. 7).</w:t>
+      </w:r>
+    </w:p>
+    <w:p>
+      <w:pPr>
+        <w:spacing w:line="360" w:lineRule="auto"/>
+        <w:ind w:left="227" w:right="227"/>
+      </w:pPr>
+    </w:p>
+    <w:p>
+      <w:pPr>
+        <w:spacing w:line="360" w:lineRule="auto"/>
+        <w:ind w:left="227" w:right="227"/>
+        <w:rPr>
+          <w:b/>
+          <w:bCs/>
+        </w:rPr>
+      </w:pPr>
+      <w:r>
+        <w:rPr>
+          <w:b/>
+          <w:bCs/>
+        </w:rPr>
+        <w:t>Note:</w:t>
+      </w:r>
+      <w:r>
+        <w:t xml:space="preserve"> Please for extensive overview of the codebase refer to my GitLab (see the feature branch for latest changes): </w:t>
+      </w:r>
+      <w:hyperlink r:id="rId15" w:history="1">
+        <w:r>
+          <w:rPr>
+            <w:rStyle w:val="Hyperlink"/>
+          </w:rPr>
+          <w:t>https://git.fhict.nl/I570737/individual-project-truepartner/-/tree/feature?ref_type=</w:t>
+        </w:r>
+        <w:r>
+          <w:rPr>
+            <w:rStyle w:val="Hyperlink"/>
+          </w:rPr>
+          <w:t>h</w:t>
+        </w:r>
+        <w:r>
+          <w:rPr>
+            <w:rStyle w:val="Hyperlink"/>
+          </w:rPr>
+          <w:t>eads</w:t>
+        </w:r>
+      </w:hyperlink>
+      <w:r>
+        <w:t xml:space="preserve">.   </w:t>
+      </w:r>
+      <w:r>
+        <w:rPr>
+          <w:b/>
+          <w:bCs/>
+        </w:rPr>
+        <w:br w:type="page"/>
+      </w:r>
+      <w:r>
+        <w:rPr>
+          <w:b/>
+          <w:bCs/>
+        </w:rPr>
+        <w:lastRenderedPageBreak/>
+        <w:tab/>
+      </w:r>
+      <w:r>
+        <w:rPr>
+          <w:b/>
+          <w:bCs/>
+        </w:rPr>
+        <w:tab/>
+      </w:r>
+    </w:p>
+    <w:p>
+      <w:pPr>
         <w:pStyle w:val="Heading2"/>
         <w:jc w:val="left"/>
         <w:rPr>
@@ -805,8 +2867,590 @@
           <w:bCs/>
           <w:color w:val="auto"/>
         </w:rPr>
-        <w:lastRenderedPageBreak/>
         <w:t xml:space="preserve">Development methodology and techniques  </w:t>
+      </w:r>
+    </w:p>
+    <w:p>
+      <w:pPr>
+        <w:spacing w:line="360" w:lineRule="auto"/>
+        <w:ind w:left="567" w:hanging="142"/>
+        <w:rPr>
+          <w:b/>
+          <w:bCs/>
+          <w:lang w:val="en-US"/>
+        </w:rPr>
+      </w:pPr>
+      <w:r>
+        <w:rPr>
+          <w:b/>
+          <w:bCs/>
+          <w:lang w:val="en-US"/>
+        </w:rPr>
+        <w:t>SOLID Principles Applied</w:t>
+      </w:r>
+    </w:p>
+    <w:p>
+      <w:pPr>
+        <w:spacing w:line="360" w:lineRule="auto"/>
+        <w:ind w:left="567" w:hanging="142"/>
+        <w:rPr>
+          <w:b/>
+          <w:bCs/>
+          <w:lang w:val="en-US"/>
+        </w:rPr>
+      </w:pPr>
+      <w:r>
+        <w:rPr>
+          <w:b/>
+          <w:bCs/>
+          <w:lang w:val="en-US"/>
+        </w:rPr>
+        <w:t>S - Single Responsibility Principle</w:t>
+      </w:r>
+    </w:p>
+    <w:p>
+      <w:pPr>
+        <w:spacing w:line="360" w:lineRule="auto"/>
+        <w:ind w:left="567" w:hanging="142"/>
+        <w:rPr>
+          <w:lang w:val="en-US"/>
+        </w:rPr>
+      </w:pPr>
+      <w:r>
+        <w:rPr>
+          <w:lang w:val="en-US"/>
+        </w:rPr>
+        <w:t>Applied in multiple places:</w:t>
+      </w:r>
+    </w:p>
+    <w:p>
+      <w:pPr>
+        <w:numPr>
+          <w:ilvl w:val="0"/>
+          <w:numId w:val="1"/>
+        </w:numPr>
+        <w:spacing w:line="360" w:lineRule="auto"/>
+        <w:ind w:left="567" w:hanging="142"/>
+        <w:rPr>
+          <w:lang w:val="en-US"/>
+        </w:rPr>
+      </w:pPr>
+      <w:proofErr w:type="spellStart"/>
+      <w:proofErr w:type="gramStart"/>
+      <w:r>
+        <w:rPr>
+          <w:lang w:val="en-US"/>
+        </w:rPr>
+        <w:t>CarService</w:t>
+      </w:r>
+      <w:proofErr w:type="spellEnd"/>
+      <w:proofErr w:type="gramEnd"/>
+      <w:r>
+        <w:rPr>
+          <w:lang w:val="en-US"/>
+        </w:rPr>
+        <w:t>: orchestration and business-level validation</w:t>
+      </w:r>
+    </w:p>
+    <w:p>
+      <w:pPr>
+        <w:numPr>
+          <w:ilvl w:val="0"/>
+          <w:numId w:val="1"/>
+        </w:numPr>
+        <w:spacing w:line="360" w:lineRule="auto"/>
+        <w:ind w:left="567" w:hanging="142"/>
+        <w:rPr>
+          <w:lang w:val="en-US"/>
+        </w:rPr>
+      </w:pPr>
+      <w:proofErr w:type="spellStart"/>
+      <w:r>
+        <w:rPr>
+          <w:lang w:val="en-US"/>
+        </w:rPr>
+        <w:t>CarRepository</w:t>
+      </w:r>
+      <w:proofErr w:type="spellEnd"/>
+      <w:r>
+        <w:rPr>
+          <w:lang w:val="en-US"/>
+        </w:rPr>
+        <w:t>: data querying and persistence</w:t>
+      </w:r>
+    </w:p>
+    <w:p>
+      <w:pPr>
+        <w:numPr>
+          <w:ilvl w:val="0"/>
+          <w:numId w:val="1"/>
+        </w:numPr>
+        <w:spacing w:line="360" w:lineRule="auto"/>
+        <w:ind w:left="567" w:hanging="142"/>
+        <w:rPr>
+          <w:lang w:val="en-US"/>
+        </w:rPr>
+      </w:pPr>
+      <w:proofErr w:type="spellStart"/>
+      <w:r>
+        <w:rPr>
+          <w:lang w:val="en-US"/>
+        </w:rPr>
+        <w:t>CarDTO</w:t>
+      </w:r>
+      <w:proofErr w:type="spellEnd"/>
+      <w:r>
+        <w:rPr>
+          <w:lang w:val="en-US"/>
+        </w:rPr>
+        <w:t>: UI binding model only</w:t>
+      </w:r>
+    </w:p>
+    <w:p>
+      <w:pPr>
+        <w:numPr>
+          <w:ilvl w:val="0"/>
+          <w:numId w:val="1"/>
+        </w:numPr>
+        <w:spacing w:line="360" w:lineRule="auto"/>
+        <w:ind w:left="567" w:hanging="142"/>
+        <w:rPr>
+          <w:lang w:val="en-US"/>
+        </w:rPr>
+      </w:pPr>
+      <w:proofErr w:type="spellStart"/>
+      <w:r>
+        <w:rPr>
+          <w:lang w:val="en-US"/>
+        </w:rPr>
+        <w:t>CarSearchCriteria</w:t>
+      </w:r>
+      <w:proofErr w:type="spellEnd"/>
+      <w:r>
+        <w:rPr>
+          <w:lang w:val="en-US"/>
+        </w:rPr>
+        <w:t xml:space="preserve"> / </w:t>
+      </w:r>
+      <w:proofErr w:type="spellStart"/>
+      <w:r>
+        <w:rPr>
+          <w:lang w:val="en-US"/>
+        </w:rPr>
+        <w:t>PagedResult</w:t>
+      </w:r>
+      <w:proofErr w:type="spellEnd"/>
+      <w:r>
+        <w:rPr>
+          <w:lang w:val="en-US"/>
+        </w:rPr>
+        <w:t>&lt;T&gt;: shared contracts only</w:t>
+      </w:r>
+    </w:p>
+    <w:p>
+      <w:pPr>
+        <w:spacing w:line="360" w:lineRule="auto"/>
+        <w:ind w:left="567" w:hanging="142"/>
+        <w:rPr>
+          <w:lang w:val="en-US"/>
+        </w:rPr>
+      </w:pPr>
+      <w:r>
+        <w:rPr>
+          <w:lang w:val="en-US"/>
+        </w:rPr>
+        <w:t xml:space="preserve">Current gap: </w:t>
+      </w:r>
+      <w:proofErr w:type="spellStart"/>
+      <w:r>
+        <w:rPr>
+          <w:lang w:val="en-US"/>
+        </w:rPr>
+        <w:t>CarRepository</w:t>
+      </w:r>
+      <w:proofErr w:type="spellEnd"/>
+      <w:r>
+        <w:rPr>
+          <w:lang w:val="en-US"/>
+        </w:rPr>
+        <w:t xml:space="preserve"> currently holds both CRUD and filtering concerns, which may be split later.</w:t>
+      </w:r>
+    </w:p>
+    <w:p>
+      <w:pPr>
+        <w:spacing w:line="360" w:lineRule="auto"/>
+        <w:ind w:left="567" w:hanging="142"/>
+        <w:rPr>
+          <w:b/>
+          <w:bCs/>
+          <w:lang w:val="en-US"/>
+        </w:rPr>
+      </w:pPr>
+      <w:r>
+        <w:rPr>
+          <w:b/>
+          <w:bCs/>
+          <w:lang w:val="en-US"/>
+        </w:rPr>
+        <w:t>O - Open/Closed Principle</w:t>
+      </w:r>
+    </w:p>
+    <w:p>
+      <w:pPr>
+        <w:spacing w:line="360" w:lineRule="auto"/>
+        <w:ind w:left="567" w:hanging="142"/>
+        <w:rPr>
+          <w:lang w:val="en-US"/>
+        </w:rPr>
+      </w:pPr>
+      <w:r>
+        <w:rPr>
+          <w:lang w:val="en-US"/>
+        </w:rPr>
+        <w:t>The system is open for extension via interfaces:</w:t>
+      </w:r>
+    </w:p>
+    <w:p>
+      <w:pPr>
+        <w:numPr>
+          <w:ilvl w:val="0"/>
+          <w:numId w:val="2"/>
+        </w:numPr>
+        <w:spacing w:line="360" w:lineRule="auto"/>
+        <w:ind w:left="567" w:hanging="142"/>
+        <w:rPr>
+          <w:lang w:val="en-US"/>
+        </w:rPr>
+      </w:pPr>
+      <w:r>
+        <w:rPr>
+          <w:lang w:val="en-US"/>
+        </w:rPr>
+        <w:t xml:space="preserve">New repository implementations can be introduced without changing </w:t>
+      </w:r>
+      <w:proofErr w:type="spellStart"/>
+      <w:r>
+        <w:rPr>
+          <w:lang w:val="en-US"/>
+        </w:rPr>
+        <w:t>CarService</w:t>
+      </w:r>
+      <w:proofErr w:type="spellEnd"/>
+      <w:r>
+        <w:rPr>
+          <w:lang w:val="en-US"/>
+        </w:rPr>
+        <w:t>.</w:t>
+      </w:r>
+    </w:p>
+    <w:p>
+      <w:pPr>
+        <w:numPr>
+          <w:ilvl w:val="0"/>
+          <w:numId w:val="2"/>
+        </w:numPr>
+        <w:spacing w:line="360" w:lineRule="auto"/>
+        <w:ind w:left="567" w:hanging="142"/>
+        <w:rPr>
+          <w:lang w:val="en-US"/>
+        </w:rPr>
+      </w:pPr>
+      <w:r>
+        <w:rPr>
+          <w:lang w:val="en-US"/>
+        </w:rPr>
+        <w:t>Criteria-based filtering can be extended by adding fields and query clauses.</w:t>
+      </w:r>
+    </w:p>
+    <w:p>
+      <w:pPr>
+        <w:spacing w:line="360" w:lineRule="auto"/>
+        <w:ind w:left="567" w:hanging="142"/>
+        <w:rPr>
+          <w:b/>
+          <w:bCs/>
+          <w:lang w:val="en-US"/>
+        </w:rPr>
+      </w:pPr>
+      <w:r>
+        <w:rPr>
+          <w:b/>
+          <w:bCs/>
+          <w:lang w:val="en-US"/>
+        </w:rPr>
+        <w:t xml:space="preserve">L - </w:t>
+      </w:r>
+      <w:proofErr w:type="spellStart"/>
+      <w:r>
+        <w:rPr>
+          <w:b/>
+          <w:bCs/>
+          <w:lang w:val="en-US"/>
+        </w:rPr>
+        <w:t>Liskov</w:t>
+      </w:r>
+      <w:proofErr w:type="spellEnd"/>
+      <w:r>
+        <w:rPr>
+          <w:b/>
+          <w:bCs/>
+          <w:lang w:val="en-US"/>
+        </w:rPr>
+        <w:t xml:space="preserve"> Substitution Principle</w:t>
+      </w:r>
+    </w:p>
+    <w:p>
+      <w:pPr>
+        <w:spacing w:line="360" w:lineRule="auto"/>
+        <w:ind w:left="567" w:hanging="142"/>
+        <w:rPr>
+          <w:lang w:val="en-US"/>
+        </w:rPr>
+      </w:pPr>
+      <w:proofErr w:type="spellStart"/>
+      <w:r>
+        <w:rPr>
+          <w:lang w:val="en-US"/>
+        </w:rPr>
+        <w:t>CarService</w:t>
+      </w:r>
+      <w:proofErr w:type="spellEnd"/>
+      <w:r>
+        <w:rPr>
+          <w:lang w:val="en-US"/>
+        </w:rPr>
+        <w:t xml:space="preserve"> depends on interface contracts, so compliant repository implementations can be substituted without breaking behavior.</w:t>
+      </w:r>
+    </w:p>
+    <w:p>
+      <w:pPr>
+        <w:spacing w:line="360" w:lineRule="auto"/>
+        <w:ind w:left="567" w:hanging="142"/>
+        <w:rPr>
+          <w:b/>
+          <w:bCs/>
+          <w:lang w:val="en-US"/>
+        </w:rPr>
+      </w:pPr>
+      <w:r>
+        <w:rPr>
+          <w:b/>
+          <w:bCs/>
+          <w:lang w:val="en-US"/>
+        </w:rPr>
+        <w:t>I - Interface Segregation Principle</w:t>
+      </w:r>
+    </w:p>
+    <w:p>
+      <w:pPr>
+        <w:spacing w:line="360" w:lineRule="auto"/>
+        <w:ind w:left="567" w:hanging="142"/>
+        <w:rPr>
+          <w:lang w:val="en-US"/>
+        </w:rPr>
+      </w:pPr>
+      <w:r>
+        <w:rPr>
+          <w:lang w:val="en-US"/>
+        </w:rPr>
+        <w:t>Interfaces are focused:</w:t>
+      </w:r>
+    </w:p>
+    <w:p>
+      <w:pPr>
+        <w:numPr>
+          <w:ilvl w:val="0"/>
+          <w:numId w:val="3"/>
+        </w:numPr>
+        <w:spacing w:line="360" w:lineRule="auto"/>
+        <w:ind w:left="567" w:hanging="142"/>
+        <w:rPr>
+          <w:lang w:val="en-US"/>
+        </w:rPr>
+      </w:pPr>
+      <w:proofErr w:type="spellStart"/>
+      <w:r>
+        <w:rPr>
+          <w:lang w:val="en-US"/>
+        </w:rPr>
+        <w:t>ICrudRepository</w:t>
+      </w:r>
+      <w:proofErr w:type="spellEnd"/>
+      <w:r>
+        <w:rPr>
+          <w:lang w:val="en-US"/>
+        </w:rPr>
+        <w:t xml:space="preserve"> for generic CRUD behavior</w:t>
+      </w:r>
+    </w:p>
+    <w:p>
+      <w:pPr>
+        <w:numPr>
+          <w:ilvl w:val="0"/>
+          <w:numId w:val="3"/>
+        </w:numPr>
+        <w:spacing w:line="360" w:lineRule="auto"/>
+        <w:ind w:left="567" w:hanging="142"/>
+        <w:rPr>
+          <w:lang w:val="en-US"/>
+        </w:rPr>
+      </w:pPr>
+      <w:proofErr w:type="spellStart"/>
+      <w:r>
+        <w:rPr>
+          <w:lang w:val="en-US"/>
+        </w:rPr>
+        <w:t>IFilterCarRepository</w:t>
+      </w:r>
+      <w:proofErr w:type="spellEnd"/>
+      <w:r>
+        <w:rPr>
+          <w:lang w:val="en-US"/>
+        </w:rPr>
+        <w:t xml:space="preserve"> for specialized filtering/paging behavior</w:t>
+      </w:r>
+    </w:p>
+    <w:p>
+      <w:pPr>
+        <w:spacing w:line="360" w:lineRule="auto"/>
+        <w:ind w:left="567" w:hanging="142"/>
+        <w:rPr>
+          <w:lang w:val="en-US"/>
+        </w:rPr>
+      </w:pPr>
+      <w:r>
+        <w:rPr>
+          <w:lang w:val="en-US"/>
+        </w:rPr>
+        <w:t xml:space="preserve">Consumers only depend on what they </w:t>
+      </w:r>
+      <w:proofErr w:type="gramStart"/>
+      <w:r>
+        <w:rPr>
+          <w:lang w:val="en-US"/>
+        </w:rPr>
+        <w:t>actually need</w:t>
+      </w:r>
+      <w:proofErr w:type="gramEnd"/>
+      <w:r>
+        <w:rPr>
+          <w:lang w:val="en-US"/>
+        </w:rPr>
+        <w:t>.</w:t>
+      </w:r>
+    </w:p>
+    <w:p>
+      <w:pPr>
+        <w:spacing w:line="360" w:lineRule="auto"/>
+        <w:ind w:left="567" w:hanging="142"/>
+        <w:rPr>
+          <w:b/>
+          <w:bCs/>
+          <w:lang w:val="en-US"/>
+        </w:rPr>
+      </w:pPr>
+      <w:r>
+        <w:rPr>
+          <w:b/>
+          <w:bCs/>
+          <w:lang w:val="en-US"/>
+        </w:rPr>
+        <w:t>D - Dependency Inversion Principle</w:t>
+      </w:r>
+    </w:p>
+    <w:p>
+      <w:pPr>
+        <w:spacing w:line="360" w:lineRule="auto"/>
+        <w:ind w:left="567" w:hanging="142"/>
+        <w:rPr>
+          <w:lang w:val="en-US"/>
+        </w:rPr>
+      </w:pPr>
+      <w:r>
+        <w:rPr>
+          <w:lang w:val="en-US"/>
+        </w:rPr>
+        <w:t>Strongly present:</w:t>
+      </w:r>
+    </w:p>
+    <w:p>
+      <w:pPr>
+        <w:numPr>
+          <w:ilvl w:val="0"/>
+          <w:numId w:val="4"/>
+        </w:numPr>
+        <w:spacing w:line="360" w:lineRule="auto"/>
+        <w:ind w:left="567" w:hanging="142"/>
+        <w:rPr>
+          <w:lang w:val="en-US"/>
+        </w:rPr>
+      </w:pPr>
+      <w:r>
+        <w:rPr>
+          <w:lang w:val="en-US"/>
+        </w:rPr>
+        <w:t>Business logic depends on abstractions (</w:t>
+      </w:r>
+      <w:proofErr w:type="spellStart"/>
+      <w:r>
+        <w:rPr>
+          <w:lang w:val="en-US"/>
+        </w:rPr>
+        <w:t>ICrudRepository</w:t>
+      </w:r>
+      <w:proofErr w:type="spellEnd"/>
+      <w:r>
+        <w:rPr>
+          <w:lang w:val="en-US"/>
+        </w:rPr>
+        <w:t xml:space="preserve">, </w:t>
+      </w:r>
+      <w:proofErr w:type="spellStart"/>
+      <w:r>
+        <w:rPr>
+          <w:lang w:val="en-US"/>
+        </w:rPr>
+        <w:t>IFilterCarRepository</w:t>
+      </w:r>
+      <w:proofErr w:type="spellEnd"/>
+      <w:r>
+        <w:rPr>
+          <w:lang w:val="en-US"/>
+        </w:rPr>
+        <w:t>)</w:t>
+      </w:r>
+    </w:p>
+    <w:p>
+      <w:pPr>
+        <w:numPr>
+          <w:ilvl w:val="0"/>
+          <w:numId w:val="4"/>
+        </w:numPr>
+        <w:spacing w:line="360" w:lineRule="auto"/>
+        <w:ind w:left="567" w:hanging="142"/>
+        <w:rPr>
+          <w:lang w:val="en-US"/>
+        </w:rPr>
+      </w:pPr>
+      <w:r>
+        <w:rPr>
+          <w:lang w:val="en-US"/>
+        </w:rPr>
+        <w:t>Concrete classes are wired in the composition root (</w:t>
+      </w:r>
+      <w:proofErr w:type="spellStart"/>
+      <w:r>
+        <w:rPr>
+          <w:lang w:val="en-US"/>
+        </w:rPr>
+        <w:t>Program.cs</w:t>
+      </w:r>
+      <w:proofErr w:type="spellEnd"/>
+      <w:r>
+        <w:rPr>
+          <w:lang w:val="en-US"/>
+        </w:rPr>
+        <w:t>)</w:t>
       </w:r>
     </w:p>
     <w:p/>
@@ -838,6 +3482,619 @@
     </w:sectPr>
   </w:body>
 </w:document>
+</file>
+
+<file path=word/numbering.xml><?xml version="1.0" encoding="utf-8"?>
+<w:numbering xmlns:wpc="http://schemas.microsoft.com/office/word/2010/wordprocessingCanvas" xmlns:cx="http://schemas.microsoft.com/office/drawing/2014/chartex" xmlns:cx1="http://schemas.microsoft.com/office/drawing/2015/9/8/chartex" xmlns:cx2="http://schemas.microsoft.com/office/drawing/2015/10/21/chartex" xmlns:cx3="http://schemas.microsoft.com/office/drawing/2016/5/9/chartex" xmlns:cx4="http://schemas.microsoft.com/office/drawing/2016/5/10/chartex" xmlns:cx5="http://schemas.microsoft.com/office/drawing/2016/5/11/chartex" xmlns:cx6="http://schemas.microsoft.com/office/drawing/2016/5/12/chartex" xmlns:cx7="http://schemas.microsoft.com/office/drawing/2016/5/13/chartex" xmlns:cx8="http://schemas.microsoft.com/office/drawing/2016/5/14/chartex" xmlns:mc="http://schemas.openxmlformats.org/markup-compatibility/2006" xmlns:aink="http://schemas.microsoft.com/office/drawing/2016/ink" xmlns:am3d="http://schemas.microsoft.com/office/drawing/2017/model3d" xmlns:o="urn:schemas-microsoft-com:office:office" xmlns:oel="http://schemas.microsoft.com/office/2019/extlst" xmlns:r="http://schemas.openxmlformats.org/officeDocument/2006/relationships" xmlns:m="http://schemas.openxmlformats.org/officeDocument/2006/math" xmlns:v="urn:schemas-microsoft-com:vml" xmlns:wp14="http://schemas.microsoft.com/office/word/2010/wordprocessingDrawing" xmlns:wp="http://schemas.openxmlformats.org/drawingml/2006/wordprocessingDrawing" xmlns:w10="urn:schemas-microsoft-com:office:word" xmlns:w="http://schemas.openxmlformats.org/wordprocessingml/2006/main" xmlns:w14="http://schemas.microsoft.com/office/word/2010/wordml" xmlns:w15="http://schemas.microsoft.com/office/word/2012/wordml" xmlns:w16cex="http://schemas.microsoft.com/office/word/2018/wordml/cex" xmlns:w16cid="http://schemas.microsoft.com/office/word/2016/wordml/cid" xmlns:w16="http://schemas.microsoft.com/office/word/2018/wordml" xmlns:w16du="http://schemas.microsoft.com/office/word/2023/wordml/word16du" xmlns:w16sdtdh="http://schemas.microsoft.com/office/word/2020/wordml/sdtdatahash" xmlns:w16sdtfl="http://schemas.microsoft.com/office/word/2024/wordml/sdtformatlock" xmlns:w16se="http://schemas.microsoft.com/office/word/2015/wordml/symex" xmlns:wpg="http://schemas.microsoft.com/office/word/2010/wordprocessingGroup" xmlns:wpi="http://schemas.microsoft.com/office/word/2010/wordprocessingInk" xmlns:wne="http://schemas.microsoft.com/office/word/2006/wordml" xmlns:wps="http://schemas.microsoft.com/office/word/2010/wordprocessingShape" mc:Ignorable="w14 w15 w16se w16cid w16 w16cex w16sdtdh w16sdtfl w16du wp14">
+  <w:abstractNum w:abstractNumId="0" w15:restartNumberingAfterBreak="0">
+    <w:nsid w:val="1D0F7477"/>
+    <w:multiLevelType w:val="multilevel"/>
+    <w:tmpl w:val="9244CFB8"/>
+    <w:lvl w:ilvl="0">
+      <w:start w:val="1"/>
+      <w:numFmt w:val="bullet"/>
+      <w:lvlText w:val=""/>
+      <w:lvlJc w:val="left"/>
+      <w:pPr>
+        <w:tabs>
+          <w:tab w:val="num" w:pos="720"/>
+        </w:tabs>
+        <w:ind w:left="720" w:hanging="360"/>
+      </w:pPr>
+      <w:rPr>
+        <w:rFonts w:ascii="Symbol" w:hAnsi="Symbol" w:hint="default"/>
+        <w:sz w:val="20"/>
+      </w:rPr>
+    </w:lvl>
+    <w:lvl w:ilvl="1" w:tentative="1">
+      <w:start w:val="1"/>
+      <w:numFmt w:val="bullet"/>
+      <w:lvlText w:val="o"/>
+      <w:lvlJc w:val="left"/>
+      <w:pPr>
+        <w:tabs>
+          <w:tab w:val="num" w:pos="1440"/>
+        </w:tabs>
+        <w:ind w:left="1440" w:hanging="360"/>
+      </w:pPr>
+      <w:rPr>
+        <w:rFonts w:ascii="Courier New" w:hAnsi="Courier New" w:hint="default"/>
+        <w:sz w:val="20"/>
+      </w:rPr>
+    </w:lvl>
+    <w:lvl w:ilvl="2" w:tentative="1">
+      <w:start w:val="1"/>
+      <w:numFmt w:val="bullet"/>
+      <w:lvlText w:val=""/>
+      <w:lvlJc w:val="left"/>
+      <w:pPr>
+        <w:tabs>
+          <w:tab w:val="num" w:pos="2160"/>
+        </w:tabs>
+        <w:ind w:left="2160" w:hanging="360"/>
+      </w:pPr>
+      <w:rPr>
+        <w:rFonts w:ascii="Wingdings" w:hAnsi="Wingdings" w:hint="default"/>
+        <w:sz w:val="20"/>
+      </w:rPr>
+    </w:lvl>
+    <w:lvl w:ilvl="3" w:tentative="1">
+      <w:start w:val="1"/>
+      <w:numFmt w:val="bullet"/>
+      <w:lvlText w:val=""/>
+      <w:lvlJc w:val="left"/>
+      <w:pPr>
+        <w:tabs>
+          <w:tab w:val="num" w:pos="2880"/>
+        </w:tabs>
+        <w:ind w:left="2880" w:hanging="360"/>
+      </w:pPr>
+      <w:rPr>
+        <w:rFonts w:ascii="Wingdings" w:hAnsi="Wingdings" w:hint="default"/>
+        <w:sz w:val="20"/>
+      </w:rPr>
+    </w:lvl>
+    <w:lvl w:ilvl="4" w:tentative="1">
+      <w:start w:val="1"/>
+      <w:numFmt w:val="bullet"/>
+      <w:lvlText w:val=""/>
+      <w:lvlJc w:val="left"/>
+      <w:pPr>
+        <w:tabs>
+          <w:tab w:val="num" w:pos="3600"/>
+        </w:tabs>
+        <w:ind w:left="3600" w:hanging="360"/>
+      </w:pPr>
+      <w:rPr>
+        <w:rFonts w:ascii="Wingdings" w:hAnsi="Wingdings" w:hint="default"/>
+        <w:sz w:val="20"/>
+      </w:rPr>
+    </w:lvl>
+    <w:lvl w:ilvl="5" w:tentative="1">
+      <w:start w:val="1"/>
+      <w:numFmt w:val="bullet"/>
+      <w:lvlText w:val=""/>
+      <w:lvlJc w:val="left"/>
+      <w:pPr>
+        <w:tabs>
+          <w:tab w:val="num" w:pos="4320"/>
+        </w:tabs>
+        <w:ind w:left="4320" w:hanging="360"/>
+      </w:pPr>
+      <w:rPr>
+        <w:rFonts w:ascii="Wingdings" w:hAnsi="Wingdings" w:hint="default"/>
+        <w:sz w:val="20"/>
+      </w:rPr>
+    </w:lvl>
+    <w:lvl w:ilvl="6" w:tentative="1">
+      <w:start w:val="1"/>
+      <w:numFmt w:val="bullet"/>
+      <w:lvlText w:val=""/>
+      <w:lvlJc w:val="left"/>
+      <w:pPr>
+        <w:tabs>
+          <w:tab w:val="num" w:pos="5040"/>
+        </w:tabs>
+        <w:ind w:left="5040" w:hanging="360"/>
+      </w:pPr>
+      <w:rPr>
+        <w:rFonts w:ascii="Wingdings" w:hAnsi="Wingdings" w:hint="default"/>
+        <w:sz w:val="20"/>
+      </w:rPr>
+    </w:lvl>
+    <w:lvl w:ilvl="7" w:tentative="1">
+      <w:start w:val="1"/>
+      <w:numFmt w:val="bullet"/>
+      <w:lvlText w:val=""/>
+      <w:lvlJc w:val="left"/>
+      <w:pPr>
+        <w:tabs>
+          <w:tab w:val="num" w:pos="5760"/>
+        </w:tabs>
+        <w:ind w:left="5760" w:hanging="360"/>
+      </w:pPr>
+      <w:rPr>
+        <w:rFonts w:ascii="Wingdings" w:hAnsi="Wingdings" w:hint="default"/>
+        <w:sz w:val="20"/>
+      </w:rPr>
+    </w:lvl>
+    <w:lvl w:ilvl="8" w:tentative="1">
+      <w:start w:val="1"/>
+      <w:numFmt w:val="bullet"/>
+      <w:lvlText w:val=""/>
+      <w:lvlJc w:val="left"/>
+      <w:pPr>
+        <w:tabs>
+          <w:tab w:val="num" w:pos="6480"/>
+        </w:tabs>
+        <w:ind w:left="6480" w:hanging="360"/>
+      </w:pPr>
+      <w:rPr>
+        <w:rFonts w:ascii="Wingdings" w:hAnsi="Wingdings" w:hint="default"/>
+        <w:sz w:val="20"/>
+      </w:rPr>
+    </w:lvl>
+  </w:abstractNum>
+  <w:abstractNum w:abstractNumId="1" w15:restartNumberingAfterBreak="0">
+    <w:nsid w:val="1E805EAD"/>
+    <w:multiLevelType w:val="multilevel"/>
+    <w:tmpl w:val="D49609FC"/>
+    <w:lvl w:ilvl="0">
+      <w:start w:val="1"/>
+      <w:numFmt w:val="bullet"/>
+      <w:lvlText w:val=""/>
+      <w:lvlJc w:val="left"/>
+      <w:pPr>
+        <w:tabs>
+          <w:tab w:val="num" w:pos="720"/>
+        </w:tabs>
+        <w:ind w:left="720" w:hanging="360"/>
+      </w:pPr>
+      <w:rPr>
+        <w:rFonts w:ascii="Symbol" w:hAnsi="Symbol" w:hint="default"/>
+        <w:sz w:val="20"/>
+      </w:rPr>
+    </w:lvl>
+    <w:lvl w:ilvl="1" w:tentative="1">
+      <w:start w:val="1"/>
+      <w:numFmt w:val="bullet"/>
+      <w:lvlText w:val="o"/>
+      <w:lvlJc w:val="left"/>
+      <w:pPr>
+        <w:tabs>
+          <w:tab w:val="num" w:pos="1440"/>
+        </w:tabs>
+        <w:ind w:left="1440" w:hanging="360"/>
+      </w:pPr>
+      <w:rPr>
+        <w:rFonts w:ascii="Courier New" w:hAnsi="Courier New" w:hint="default"/>
+        <w:sz w:val="20"/>
+      </w:rPr>
+    </w:lvl>
+    <w:lvl w:ilvl="2" w:tentative="1">
+      <w:start w:val="1"/>
+      <w:numFmt w:val="bullet"/>
+      <w:lvlText w:val=""/>
+      <w:lvlJc w:val="left"/>
+      <w:pPr>
+        <w:tabs>
+          <w:tab w:val="num" w:pos="2160"/>
+        </w:tabs>
+        <w:ind w:left="2160" w:hanging="360"/>
+      </w:pPr>
+      <w:rPr>
+        <w:rFonts w:ascii="Wingdings" w:hAnsi="Wingdings" w:hint="default"/>
+        <w:sz w:val="20"/>
+      </w:rPr>
+    </w:lvl>
+    <w:lvl w:ilvl="3" w:tentative="1">
+      <w:start w:val="1"/>
+      <w:numFmt w:val="bullet"/>
+      <w:lvlText w:val=""/>
+      <w:lvlJc w:val="left"/>
+      <w:pPr>
+        <w:tabs>
+          <w:tab w:val="num" w:pos="2880"/>
+        </w:tabs>
+        <w:ind w:left="2880" w:hanging="360"/>
+      </w:pPr>
+      <w:rPr>
+        <w:rFonts w:ascii="Wingdings" w:hAnsi="Wingdings" w:hint="default"/>
+        <w:sz w:val="20"/>
+      </w:rPr>
+    </w:lvl>
+    <w:lvl w:ilvl="4" w:tentative="1">
+      <w:start w:val="1"/>
+      <w:numFmt w:val="bullet"/>
+      <w:lvlText w:val=""/>
+      <w:lvlJc w:val="left"/>
+      <w:pPr>
+        <w:tabs>
+          <w:tab w:val="num" w:pos="3600"/>
+        </w:tabs>
+        <w:ind w:left="3600" w:hanging="360"/>
+      </w:pPr>
+      <w:rPr>
+        <w:rFonts w:ascii="Wingdings" w:hAnsi="Wingdings" w:hint="default"/>
+        <w:sz w:val="20"/>
+      </w:rPr>
+    </w:lvl>
+    <w:lvl w:ilvl="5" w:tentative="1">
+      <w:start w:val="1"/>
+      <w:numFmt w:val="bullet"/>
+      <w:lvlText w:val=""/>
+      <w:lvlJc w:val="left"/>
+      <w:pPr>
+        <w:tabs>
+          <w:tab w:val="num" w:pos="4320"/>
+        </w:tabs>
+        <w:ind w:left="4320" w:hanging="360"/>
+      </w:pPr>
+      <w:rPr>
+        <w:rFonts w:ascii="Wingdings" w:hAnsi="Wingdings" w:hint="default"/>
+        <w:sz w:val="20"/>
+      </w:rPr>
+    </w:lvl>
+    <w:lvl w:ilvl="6" w:tentative="1">
+      <w:start w:val="1"/>
+      <w:numFmt w:val="bullet"/>
+      <w:lvlText w:val=""/>
+      <w:lvlJc w:val="left"/>
+      <w:pPr>
+        <w:tabs>
+          <w:tab w:val="num" w:pos="5040"/>
+        </w:tabs>
+        <w:ind w:left="5040" w:hanging="360"/>
+      </w:pPr>
+      <w:rPr>
+        <w:rFonts w:ascii="Wingdings" w:hAnsi="Wingdings" w:hint="default"/>
+        <w:sz w:val="20"/>
+      </w:rPr>
+    </w:lvl>
+    <w:lvl w:ilvl="7" w:tentative="1">
+      <w:start w:val="1"/>
+      <w:numFmt w:val="bullet"/>
+      <w:lvlText w:val=""/>
+      <w:lvlJc w:val="left"/>
+      <w:pPr>
+        <w:tabs>
+          <w:tab w:val="num" w:pos="5760"/>
+        </w:tabs>
+        <w:ind w:left="5760" w:hanging="360"/>
+      </w:pPr>
+      <w:rPr>
+        <w:rFonts w:ascii="Wingdings" w:hAnsi="Wingdings" w:hint="default"/>
+        <w:sz w:val="20"/>
+      </w:rPr>
+    </w:lvl>
+    <w:lvl w:ilvl="8" w:tentative="1">
+      <w:start w:val="1"/>
+      <w:numFmt w:val="bullet"/>
+      <w:lvlText w:val=""/>
+      <w:lvlJc w:val="left"/>
+      <w:pPr>
+        <w:tabs>
+          <w:tab w:val="num" w:pos="6480"/>
+        </w:tabs>
+        <w:ind w:left="6480" w:hanging="360"/>
+      </w:pPr>
+      <w:rPr>
+        <w:rFonts w:ascii="Wingdings" w:hAnsi="Wingdings" w:hint="default"/>
+        <w:sz w:val="20"/>
+      </w:rPr>
+    </w:lvl>
+  </w:abstractNum>
+  <w:abstractNum w:abstractNumId="2" w15:restartNumberingAfterBreak="0">
+    <w:nsid w:val="3CB817DC"/>
+    <w:multiLevelType w:val="multilevel"/>
+    <w:tmpl w:val="FFFC1E74"/>
+    <w:lvl w:ilvl="0">
+      <w:start w:val="1"/>
+      <w:numFmt w:val="bullet"/>
+      <w:lvlText w:val=""/>
+      <w:lvlJc w:val="left"/>
+      <w:pPr>
+        <w:tabs>
+          <w:tab w:val="num" w:pos="720"/>
+        </w:tabs>
+        <w:ind w:left="720" w:hanging="360"/>
+      </w:pPr>
+      <w:rPr>
+        <w:rFonts w:ascii="Symbol" w:hAnsi="Symbol" w:hint="default"/>
+        <w:sz w:val="20"/>
+      </w:rPr>
+    </w:lvl>
+    <w:lvl w:ilvl="1" w:tentative="1">
+      <w:start w:val="1"/>
+      <w:numFmt w:val="bullet"/>
+      <w:lvlText w:val="o"/>
+      <w:lvlJc w:val="left"/>
+      <w:pPr>
+        <w:tabs>
+          <w:tab w:val="num" w:pos="1440"/>
+        </w:tabs>
+        <w:ind w:left="1440" w:hanging="360"/>
+      </w:pPr>
+      <w:rPr>
+        <w:rFonts w:ascii="Courier New" w:hAnsi="Courier New" w:hint="default"/>
+        <w:sz w:val="20"/>
+      </w:rPr>
+    </w:lvl>
+    <w:lvl w:ilvl="2" w:tentative="1">
+      <w:start w:val="1"/>
+      <w:numFmt w:val="bullet"/>
+      <w:lvlText w:val=""/>
+      <w:lvlJc w:val="left"/>
+      <w:pPr>
+        <w:tabs>
+          <w:tab w:val="num" w:pos="2160"/>
+        </w:tabs>
+        <w:ind w:left="2160" w:hanging="360"/>
+      </w:pPr>
+      <w:rPr>
+        <w:rFonts w:ascii="Wingdings" w:hAnsi="Wingdings" w:hint="default"/>
+        <w:sz w:val="20"/>
+      </w:rPr>
+    </w:lvl>
+    <w:lvl w:ilvl="3" w:tentative="1">
+      <w:start w:val="1"/>
+      <w:numFmt w:val="bullet"/>
+      <w:lvlText w:val=""/>
+      <w:lvlJc w:val="left"/>
+      <w:pPr>
+        <w:tabs>
+          <w:tab w:val="num" w:pos="2880"/>
+        </w:tabs>
+        <w:ind w:left="2880" w:hanging="360"/>
+      </w:pPr>
+      <w:rPr>
+        <w:rFonts w:ascii="Wingdings" w:hAnsi="Wingdings" w:hint="default"/>
+        <w:sz w:val="20"/>
+      </w:rPr>
+    </w:lvl>
+    <w:lvl w:ilvl="4" w:tentative="1">
+      <w:start w:val="1"/>
+      <w:numFmt w:val="bullet"/>
+      <w:lvlText w:val=""/>
+      <w:lvlJc w:val="left"/>
+      <w:pPr>
+        <w:tabs>
+          <w:tab w:val="num" w:pos="3600"/>
+        </w:tabs>
+        <w:ind w:left="3600" w:hanging="360"/>
+      </w:pPr>
+      <w:rPr>
+        <w:rFonts w:ascii="Wingdings" w:hAnsi="Wingdings" w:hint="default"/>
+        <w:sz w:val="20"/>
+      </w:rPr>
+    </w:lvl>
+    <w:lvl w:ilvl="5" w:tentative="1">
+      <w:start w:val="1"/>
+      <w:numFmt w:val="bullet"/>
+      <w:lvlText w:val=""/>
+      <w:lvlJc w:val="left"/>
+      <w:pPr>
+        <w:tabs>
+          <w:tab w:val="num" w:pos="4320"/>
+        </w:tabs>
+        <w:ind w:left="4320" w:hanging="360"/>
+      </w:pPr>
+      <w:rPr>
+        <w:rFonts w:ascii="Wingdings" w:hAnsi="Wingdings" w:hint="default"/>
+        <w:sz w:val="20"/>
+      </w:rPr>
+    </w:lvl>
+    <w:lvl w:ilvl="6" w:tentative="1">
+      <w:start w:val="1"/>
+      <w:numFmt w:val="bullet"/>
+      <w:lvlText w:val=""/>
+      <w:lvlJc w:val="left"/>
+      <w:pPr>
+        <w:tabs>
+          <w:tab w:val="num" w:pos="5040"/>
+        </w:tabs>
+        <w:ind w:left="5040" w:hanging="360"/>
+      </w:pPr>
+      <w:rPr>
+        <w:rFonts w:ascii="Wingdings" w:hAnsi="Wingdings" w:hint="default"/>
+        <w:sz w:val="20"/>
+      </w:rPr>
+    </w:lvl>
+    <w:lvl w:ilvl="7" w:tentative="1">
+      <w:start w:val="1"/>
+      <w:numFmt w:val="bullet"/>
+      <w:lvlText w:val=""/>
+      <w:lvlJc w:val="left"/>
+      <w:pPr>
+        <w:tabs>
+          <w:tab w:val="num" w:pos="5760"/>
+        </w:tabs>
+        <w:ind w:left="5760" w:hanging="360"/>
+      </w:pPr>
+      <w:rPr>
+        <w:rFonts w:ascii="Wingdings" w:hAnsi="Wingdings" w:hint="default"/>
+        <w:sz w:val="20"/>
+      </w:rPr>
+    </w:lvl>
+    <w:lvl w:ilvl="8" w:tentative="1">
+      <w:start w:val="1"/>
+      <w:numFmt w:val="bullet"/>
+      <w:lvlText w:val=""/>
+      <w:lvlJc w:val="left"/>
+      <w:pPr>
+        <w:tabs>
+          <w:tab w:val="num" w:pos="6480"/>
+        </w:tabs>
+        <w:ind w:left="6480" w:hanging="360"/>
+      </w:pPr>
+      <w:rPr>
+        <w:rFonts w:ascii="Wingdings" w:hAnsi="Wingdings" w:hint="default"/>
+        <w:sz w:val="20"/>
+      </w:rPr>
+    </w:lvl>
+  </w:abstractNum>
+  <w:abstractNum w:abstractNumId="3" w15:restartNumberingAfterBreak="0">
+    <w:nsid w:val="798A6F01"/>
+    <w:multiLevelType w:val="multilevel"/>
+    <w:tmpl w:val="9CFAC336"/>
+    <w:lvl w:ilvl="0">
+      <w:start w:val="1"/>
+      <w:numFmt w:val="bullet"/>
+      <w:lvlText w:val=""/>
+      <w:lvlJc w:val="left"/>
+      <w:pPr>
+        <w:tabs>
+          <w:tab w:val="num" w:pos="720"/>
+        </w:tabs>
+        <w:ind w:left="720" w:hanging="360"/>
+      </w:pPr>
+      <w:rPr>
+        <w:rFonts w:ascii="Symbol" w:hAnsi="Symbol" w:hint="default"/>
+        <w:sz w:val="20"/>
+      </w:rPr>
+    </w:lvl>
+    <w:lvl w:ilvl="1" w:tentative="1">
+      <w:start w:val="1"/>
+      <w:numFmt w:val="bullet"/>
+      <w:lvlText w:val="o"/>
+      <w:lvlJc w:val="left"/>
+      <w:pPr>
+        <w:tabs>
+          <w:tab w:val="num" w:pos="1440"/>
+        </w:tabs>
+        <w:ind w:left="1440" w:hanging="360"/>
+      </w:pPr>
+      <w:rPr>
+        <w:rFonts w:ascii="Courier New" w:hAnsi="Courier New" w:hint="default"/>
+        <w:sz w:val="20"/>
+      </w:rPr>
+    </w:lvl>
+    <w:lvl w:ilvl="2" w:tentative="1">
+      <w:start w:val="1"/>
+      <w:numFmt w:val="bullet"/>
+      <w:lvlText w:val=""/>
+      <w:lvlJc w:val="left"/>
+      <w:pPr>
+        <w:tabs>
+          <w:tab w:val="num" w:pos="2160"/>
+        </w:tabs>
+        <w:ind w:left="2160" w:hanging="360"/>
+      </w:pPr>
+      <w:rPr>
+        <w:rFonts w:ascii="Wingdings" w:hAnsi="Wingdings" w:hint="default"/>
+        <w:sz w:val="20"/>
+      </w:rPr>
+    </w:lvl>
+    <w:lvl w:ilvl="3" w:tentative="1">
+      <w:start w:val="1"/>
+      <w:numFmt w:val="bullet"/>
+      <w:lvlText w:val=""/>
+      <w:lvlJc w:val="left"/>
+      <w:pPr>
+        <w:tabs>
+          <w:tab w:val="num" w:pos="2880"/>
+        </w:tabs>
+        <w:ind w:left="2880" w:hanging="360"/>
+      </w:pPr>
+      <w:rPr>
+        <w:rFonts w:ascii="Wingdings" w:hAnsi="Wingdings" w:hint="default"/>
+        <w:sz w:val="20"/>
+      </w:rPr>
+    </w:lvl>
+    <w:lvl w:ilvl="4" w:tentative="1">
+      <w:start w:val="1"/>
+      <w:numFmt w:val="bullet"/>
+      <w:lvlText w:val=""/>
+      <w:lvlJc w:val="left"/>
+      <w:pPr>
+        <w:tabs>
+          <w:tab w:val="num" w:pos="3600"/>
+        </w:tabs>
+        <w:ind w:left="3600" w:hanging="360"/>
+      </w:pPr>
+      <w:rPr>
+        <w:rFonts w:ascii="Wingdings" w:hAnsi="Wingdings" w:hint="default"/>
+        <w:sz w:val="20"/>
+      </w:rPr>
+    </w:lvl>
+    <w:lvl w:ilvl="5" w:tentative="1">
+      <w:start w:val="1"/>
+      <w:numFmt w:val="bullet"/>
+      <w:lvlText w:val=""/>
+      <w:lvlJc w:val="left"/>
+      <w:pPr>
+        <w:tabs>
+          <w:tab w:val="num" w:pos="4320"/>
+        </w:tabs>
+        <w:ind w:left="4320" w:hanging="360"/>
+      </w:pPr>
+      <w:rPr>
+        <w:rFonts w:ascii="Wingdings" w:hAnsi="Wingdings" w:hint="default"/>
+        <w:sz w:val="20"/>
+      </w:rPr>
+    </w:lvl>
+    <w:lvl w:ilvl="6" w:tentative="1">
+      <w:start w:val="1"/>
+      <w:numFmt w:val="bullet"/>
+      <w:lvlText w:val=""/>
+      <w:lvlJc w:val="left"/>
+      <w:pPr>
+        <w:tabs>
+          <w:tab w:val="num" w:pos="5040"/>
+        </w:tabs>
+        <w:ind w:left="5040" w:hanging="360"/>
+      </w:pPr>
+      <w:rPr>
+        <w:rFonts w:ascii="Wingdings" w:hAnsi="Wingdings" w:hint="default"/>
+        <w:sz w:val="20"/>
+      </w:rPr>
+    </w:lvl>
+    <w:lvl w:ilvl="7" w:tentative="1">
+      <w:start w:val="1"/>
+      <w:numFmt w:val="bullet"/>
+      <w:lvlText w:val=""/>
+      <w:lvlJc w:val="left"/>
+      <w:pPr>
+        <w:tabs>
+          <w:tab w:val="num" w:pos="5760"/>
+        </w:tabs>
+        <w:ind w:left="5760" w:hanging="360"/>
+      </w:pPr>
+      <w:rPr>
+        <w:rFonts w:ascii="Wingdings" w:hAnsi="Wingdings" w:hint="default"/>
+        <w:sz w:val="20"/>
+      </w:rPr>
+    </w:lvl>
+    <w:lvl w:ilvl="8" w:tentative="1">
+      <w:start w:val="1"/>
+      <w:numFmt w:val="bullet"/>
+      <w:lvlText w:val=""/>
+      <w:lvlJc w:val="left"/>
+      <w:pPr>
+        <w:tabs>
+          <w:tab w:val="num" w:pos="6480"/>
+        </w:tabs>
+        <w:ind w:left="6480" w:hanging="360"/>
+      </w:pPr>
+      <w:rPr>
+        <w:rFonts w:ascii="Wingdings" w:hAnsi="Wingdings" w:hint="default"/>
+        <w:sz w:val="20"/>
+      </w:rPr>
+    </w:lvl>
+  </w:abstractNum>
+  <w:num w:numId="1" w16cid:durableId="1252935461">
+    <w:abstractNumId w:val="2"/>
+  </w:num>
+  <w:num w:numId="2" w16cid:durableId="1058557339">
+    <w:abstractNumId w:val="1"/>
+  </w:num>
+  <w:num w:numId="3" w16cid:durableId="854878235">
+    <w:abstractNumId w:val="3"/>
+  </w:num>
+  <w:num w:numId="4" w16cid:durableId="858349072">
+    <w:abstractNumId w:val="0"/>
+  </w:num>
+</w:numbering>
 </file>
 
 <file path=word/styles.xml><?xml version="1.0" encoding="utf-8"?>
@@ -1878,6 +5135,69 @@
       <w:szCs w:val="18"/>
     </w:rPr>
   </w:style>
+  <w:style w:type="paragraph" w:styleId="HTMLPreformatted">
+    <w:name w:val="HTML Preformatted"/>
+    <w:basedOn w:val="Normal"/>
+    <w:link w:val="HTMLPreformattedChar"/>
+    <w:uiPriority w:val="99"/>
+    <w:semiHidden/>
+    <w:unhideWhenUsed/>
+    <w:rsid w:val="00DA15D4"/>
+    <w:rPr>
+      <w:rFonts w:ascii="Consolas" w:hAnsi="Consolas"/>
+    </w:rPr>
+  </w:style>
+  <w:style w:type="character" w:customStyle="1" w:styleId="HTMLPreformattedChar">
+    <w:name w:val="HTML Preformatted Char"/>
+    <w:basedOn w:val="DefaultParagraphFont"/>
+    <w:link w:val="HTMLPreformatted"/>
+    <w:uiPriority w:val="99"/>
+    <w:semiHidden/>
+    <w:rsid w:val="00DA15D4"/>
+    <w:rPr>
+      <w:rFonts w:ascii="Consolas" w:eastAsia="Times New Roman" w:hAnsi="Consolas" w:cs="Times New Roman"/>
+      <w:kern w:val="0"/>
+      <w:sz w:val="20"/>
+      <w:szCs w:val="20"/>
+      <w:lang w:val="en-GB"/>
+      <w14:ligatures w14:val="none"/>
+    </w:rPr>
+  </w:style>
+  <w:style w:type="character" w:styleId="Hyperlink">
+    <w:name w:val="Hyperlink"/>
+    <w:basedOn w:val="DefaultParagraphFont"/>
+    <w:uiPriority w:val="99"/>
+    <w:unhideWhenUsed/>
+    <w:rsid w:val="00D16DBC"/>
+    <w:rPr>
+      <w:color w:val="467886" w:themeColor="hyperlink"/>
+      <w:u w:val="single"/>
+    </w:rPr>
+  </w:style>
+  <w:style w:type="character" w:styleId="UnresolvedMention">
+    <w:name w:val="Unresolved Mention"/>
+    <w:basedOn w:val="DefaultParagraphFont"/>
+    <w:uiPriority w:val="99"/>
+    <w:semiHidden/>
+    <w:unhideWhenUsed/>
+    <w:rsid w:val="00D16DBC"/>
+    <w:rPr>
+      <w:color w:val="605E5C"/>
+      <w:shd w:val="clear" w:color="auto" w:fill="E1DFDD"/>
+    </w:rPr>
+  </w:style>
+  <w:style w:type="character" w:styleId="FollowedHyperlink">
+    <w:name w:val="FollowedHyperlink"/>
+    <w:basedOn w:val="DefaultParagraphFont"/>
+    <w:uiPriority w:val="99"/>
+    <w:semiHidden/>
+    <w:unhideWhenUsed/>
+    <w:rsid w:val="00113F9B"/>
+    <w:rPr>
+      <w:color w:val="96607D" w:themeColor="followedHyperlink"/>
+      <w:u w:val="single"/>
+    </w:rPr>
+  </w:style>
 </w:styles>
 </file>
 

</xml_diff>